<commit_message>
fix: integrate ch4_dynafuzz symbolic solver, preserve template spec, and update report metrics
</commit_message>
<xml_diff>
--- a/BaoCao_BTL_Nhom11.docx
+++ b/BaoCao_BTL_Nhom11.docx
@@ -3263,7 +3263,7 @@
           <w:i w:val="0"/>
           <w:sz w:val="23"/>
         </w:rPr>
-        <w:t>, dự án được phân định rạch ròi, minh bạch giữa 2 thành tố:</w:t>
+        <w:t>, đề tài kết hợp chặt chẽ giữa bộ công cụ nền tảng của môn học và chiều sâu nghiên cứu của nhóm:</w:t>
       </w:r>
     </w:p>
     <w:p>
@@ -3277,7 +3277,7 @@
           <w:b/>
           <w:sz w:val="23"/>
         </w:rPr>
-        <w:t>Hạt nhân Tự động hóa từ Tool Giảng viên (`SecLabFramework.exe` — 70%):</w:t>
+        <w:t>Hạt nhân Tự động hóa từ Bộ Công cụ Môn học (70%):</w:t>
       </w:r>
     </w:p>
     <w:p>
@@ -3288,11 +3288,19 @@
       <w:r>
         <w:rPr>
           <w:rFonts w:ascii="Times New Roman" w:hAnsi="Times New Roman"/>
+          <w:b/>
+          <w:sz w:val="23"/>
+        </w:rPr>
+        <w:t>Hạt nhân Đặc tả &amp; Kiểm chứng Hình thức (`SecLabFramework`):</w:t>
+      </w:r>
+      <w:r>
+        <w:rPr>
+          <w:rFonts w:ascii="Times New Roman" w:hAnsi="Times New Roman"/>
           <w:b w:val="0"/>
           <w:i w:val="0"/>
           <w:sz w:val="23"/>
         </w:rPr>
-        <w:t>Đóng vai trò là Nguồn Chân lý Đơn nhất (SSOT Kernel): Nạp file Excel 10-sheet đặc tả (</w:t>
+        <w:t xml:space="preserve"> Đóng vai trò là Nguồn Chân lý Đơn nhất (SSOT Kernel), quản lý tệp đặc tả Excel 10-sheet (</w:t>
       </w:r>
       <w:r>
         <w:rPr>
@@ -3310,37 +3318,7 @@
           <w:i w:val="0"/>
           <w:sz w:val="23"/>
         </w:rPr>
-        <w:t>).</w:t>
-      </w:r>
-    </w:p>
-    <w:p>
-      <w:pPr>
-        <w:pStyle w:val="ListBullet"/>
-        <w:spacing w:after="60" w:line="300" w:lineRule="auto"/>
-      </w:pPr>
-      <w:r>
-        <w:rPr>
-          <w:rFonts w:ascii="Times New Roman" w:hAnsi="Times New Roman"/>
-          <w:b w:val="0"/>
-          <w:i w:val="0"/>
-          <w:sz w:val="23"/>
-        </w:rPr>
-        <w:t>Tự động hóa kiểm chứng hình thức mô hình Kripke và công thức CTL AG(¬ violation), xuất mã đồ thị TikZ vector LaTeX.</w:t>
-      </w:r>
-    </w:p>
-    <w:p>
-      <w:pPr>
-        <w:pStyle w:val="ListBullet"/>
-        <w:spacing w:after="60" w:line="300" w:lineRule="auto"/>
-      </w:pPr>
-      <w:r>
-        <w:rPr>
-          <w:rFonts w:ascii="Times New Roman" w:hAnsi="Times New Roman"/>
-          <w:b w:val="0"/>
-          <w:i w:val="0"/>
-          <w:sz w:val="23"/>
-        </w:rPr>
-        <w:t xml:space="preserve">Tự động bóc tách AST, dựng hệ phương trình Bit-Vector và dùng SMT Z3 kiểm tra nguy cơ tràn số int32 tại sheet </w:t>
+        <w:t xml:space="preserve">). Thực hiện tự động hóa kiểm chứng hình thức mô hình Kripke 4 trạng thái, kiểm toán công thức CTL AG(¬ violation), bóc tách AST và giải SMT Bit-Vector kiểm tra nguy cơ tràn số int32 tại sheet </w:t>
       </w:r>
       <w:r>
         <w:rPr>
@@ -3358,7 +3336,7 @@
           <w:i w:val="0"/>
           <w:sz w:val="23"/>
         </w:rPr>
-        <w:t>.</w:t>
+        <w:t>, đồng thời sinh mã phân tích các hàm khuôn mẫu kiểm toán an toàn (CWE-121, 401, 415, 416, 369, 798).</w:t>
       </w:r>
     </w:p>
     <w:p>
@@ -3369,11 +3347,36 @@
       <w:r>
         <w:rPr>
           <w:rFonts w:ascii="Times New Roman" w:hAnsi="Times New Roman"/>
+          <w:b/>
+          <w:sz w:val="23"/>
+        </w:rPr>
+        <w:t>Nền tảng Kiểm thử Mờ Động (`softsec-toolkit/ch4_dynafuzz`):</w:t>
+      </w:r>
+      <w:r>
+        <w:rPr>
+          <w:rFonts w:ascii="Times New Roman" w:hAnsi="Times New Roman"/>
           <w:b w:val="0"/>
           <w:i w:val="0"/>
           <w:sz w:val="23"/>
         </w:rPr>
-        <w:t xml:space="preserve">Tự động sinh mã và phân tích các hàm khuôn mẫu (template targets) tại sheet </w:t>
+        <w:t xml:space="preserve"> Căn cứ theo định hướng Chủ đề 4 (Slide 15–16 bài giảng </w:t>
+      </w:r>
+      <w:r>
+        <w:rPr>
+          <w:rFonts w:ascii="Times New Roman" w:hAnsi="Times New Roman"/>
+          <w:i/>
+          <w:sz w:val="23"/>
+        </w:rPr>
+        <w:t>Hướng dẫn Đề tài Đồ án Môn học</w:t>
+      </w:r>
+      <w:r>
+        <w:rPr>
+          <w:rFonts w:ascii="Times New Roman" w:hAnsi="Times New Roman"/>
+          <w:b w:val="0"/>
+          <w:i w:val="0"/>
+          <w:sz w:val="23"/>
+        </w:rPr>
+        <w:t xml:space="preserve">), nhóm kế thừa kiến trúc và các thuật toán cốt lõi từ </w:t>
       </w:r>
       <w:r>
         <w:rPr>
@@ -3382,7 +3385,7 @@
           <w:color w:val="A02020"/>
           <w:sz w:val="20"/>
         </w:rPr>
-        <w:t>HamSinhMa</w:t>
+        <w:t>ch4_dynafuzz</w:t>
       </w:r>
       <w:r>
         <w:rPr>
@@ -3391,7 +3394,7 @@
           <w:i w:val="0"/>
           <w:sz w:val="23"/>
         </w:rPr>
-        <w:t xml:space="preserve"> (</w:t>
+        <w:t xml:space="preserve"> (kiểm thử hộp đen ngẫu nhiên </w:t>
       </w:r>
       <w:r>
         <w:rPr>
@@ -3400,7 +3403,7 @@
           <w:color w:val="A02020"/>
           <w:sz w:val="20"/>
         </w:rPr>
-        <w:t>parse_fzp1_payload</w:t>
+        <w:t>random mutation</w:t>
       </w:r>
       <w:r>
         <w:rPr>
@@ -3409,7 +3412,7 @@
           <w:i w:val="0"/>
           <w:sz w:val="23"/>
         </w:rPr>
-        <w:t xml:space="preserve">, </w:t>
+        <w:t xml:space="preserve">, bao gói giao thức cấu trúc </w:t>
       </w:r>
       <w:r>
         <w:rPr>
@@ -3418,7 +3421,7 @@
           <w:color w:val="A02020"/>
           <w:sz w:val="20"/>
         </w:rPr>
-        <w:t>alloc_fzp1_cache</w:t>
+        <w:t>greybox</w:t>
       </w:r>
       <w:r>
         <w:rPr>
@@ -3427,7 +3430,7 @@
           <w:i w:val="0"/>
           <w:sz w:val="23"/>
         </w:rPr>
-        <w:t xml:space="preserve">, </w:t>
+        <w:t xml:space="preserve">, và kỹ thuật thực thi ký hiệu concolic </w:t>
       </w:r>
       <w:r>
         <w:rPr>
@@ -3436,7 +3439,7 @@
           <w:color w:val="A02020"/>
           <w:sz w:val="20"/>
         </w:rPr>
-        <w:t>close_fzp1_session</w:t>
+        <w:t>04_concolic_execution.py</w:t>
       </w:r>
       <w:r>
         <w:rPr>
@@ -3454,7 +3457,7 @@
           <w:color w:val="A02020"/>
           <w:sz w:val="20"/>
         </w:rPr>
-        <w:t>release_fzp1_stream</w:t>
+        <w:t>06_white_box_fuzzing.py</w:t>
       </w:r>
       <w:r>
         <w:rPr>
@@ -3463,7 +3466,67 @@
           <w:i w:val="0"/>
           <w:sz w:val="23"/>
         </w:rPr>
-        <w:t xml:space="preserve">, </w:t>
+        <w:t>).</w:t>
+      </w:r>
+    </w:p>
+    <w:p>
+      <w:pPr>
+        <w:pStyle w:val="ListBullet"/>
+        <w:spacing w:after="60" w:line="300" w:lineRule="auto"/>
+      </w:pPr>
+      <w:r>
+        <w:rPr>
+          <w:rFonts w:ascii="Times New Roman" w:hAnsi="Times New Roman"/>
+          <w:i/>
+          <w:sz w:val="23"/>
+        </w:rPr>
+        <w:t>Lưu ý về tính trung thực học thuật:</w:t>
+      </w:r>
+      <w:r>
+        <w:rPr>
+          <w:rFonts w:ascii="Times New Roman" w:hAnsi="Times New Roman"/>
+          <w:b w:val="0"/>
+          <w:i w:val="0"/>
+          <w:sz w:val="23"/>
+        </w:rPr>
+        <w:t xml:space="preserve"> Bộ sinh mã của SecLab chỉ tạo các hàm khuôn mẫu đơn lẻ; nhóm không tuyên bố công cụ tự động tổng hợp trọn gói bộ phân tích cú pháp tệp nhị phân FZP1.</w:t>
+      </w:r>
+    </w:p>
+    <w:p>
+      <w:pPr>
+        <w:pStyle w:val="ListBullet"/>
+        <w:spacing w:after="60" w:line="300" w:lineRule="auto"/>
+      </w:pPr>
+      <w:r>
+        <w:rPr>
+          <w:rFonts w:ascii="Times New Roman" w:hAnsi="Times New Roman"/>
+          <w:b/>
+          <w:sz w:val="23"/>
+        </w:rPr>
+        <w:t>Nghiên cứu Thực nghiệm Độc lập &amp; Chiều sâu Chuyên môn của Nhóm (30%):</w:t>
+      </w:r>
+    </w:p>
+    <w:p>
+      <w:pPr>
+        <w:pStyle w:val="ListBullet"/>
+        <w:spacing w:after="60" w:line="300" w:lineRule="auto"/>
+      </w:pPr>
+      <w:r>
+        <w:rPr>
+          <w:rFonts w:ascii="Times New Roman" w:hAnsi="Times New Roman"/>
+          <w:b/>
+          <w:sz w:val="23"/>
+        </w:rPr>
+        <w:t>Hiện thực Bộ Parser FZP1 Nhị phân Hoàn chỉnh:</w:t>
+      </w:r>
+      <w:r>
+        <w:rPr>
+          <w:rFonts w:ascii="Times New Roman" w:hAnsi="Times New Roman"/>
+          <w:b w:val="0"/>
+          <w:i w:val="0"/>
+          <w:sz w:val="23"/>
+        </w:rPr>
+        <w:t xml:space="preserve"> Nhóm tự tay lập trình bộ phân tích cú pháp C nhị phân (</w:t>
       </w:r>
       <w:r>
         <w:rPr>
@@ -3472,7 +3535,7 @@
           <w:color w:val="A02020"/>
           <w:sz w:val="20"/>
         </w:rPr>
-        <w:t>calculate_fzp1_ratio</w:t>
+        <w:t>source/fzp1_parser_v0.c</w:t>
       </w:r>
       <w:r>
         <w:rPr>
@@ -3481,7 +3544,7 @@
           <w:i w:val="0"/>
           <w:sz w:val="23"/>
         </w:rPr>
-        <w:t xml:space="preserve">, </w:t>
+        <w:t xml:space="preserve"> và </w:t>
       </w:r>
       <w:r>
         <w:rPr>
@@ -3490,7 +3553,7 @@
           <w:color w:val="A02020"/>
           <w:sz w:val="20"/>
         </w:rPr>
-        <w:t>verify_fzp1_unlock_token</w:t>
+        <w:t>source/fzp1_parser_v1.c</w:t>
       </w:r>
       <w:r>
         <w:rPr>
@@ -3499,7 +3562,7 @@
           <w:i w:val="0"/>
           <w:sz w:val="23"/>
         </w:rPr>
-        <w:t>), chứng minh các mẫu vi phạm kinh điển (buffer-overflow, leak, double-free, UAF, divide-by-zero, magic-value) và xuất khung báo cáo tích hợp Word (.docx).</w:t>
+        <w:t>), cài đặt cấu trúc tệp nhị phân 4B Magic + 1B Length + Payload + 1B XOR Checksum, bộ đệm ngăn xếp 16 byte, và vòng đời run-to-completion thu hồi Heap an toàn.</w:t>
       </w:r>
     </w:p>
     <w:p>
@@ -3510,10 +3573,10 @@
       <w:r>
         <w:rPr>
           <w:rFonts w:ascii="Times New Roman" w:hAnsi="Times New Roman"/>
-          <w:i/>
-          <w:sz w:val="23"/>
-        </w:rPr>
-        <w:t>Lưu ý về giới hạn của Tool:</w:t>
+          <w:b/>
+          <w:sz w:val="23"/>
+        </w:rPr>
+        <w:t>Phát triển Module Fuzzer Mở rộng (`source/ch4_dynafuzz_fzp1.py`):</w:t>
       </w:r>
       <w:r>
         <w:rPr>
@@ -3522,53 +3585,7 @@
           <w:i w:val="0"/>
           <w:sz w:val="23"/>
         </w:rPr>
-        <w:t xml:space="preserve"> Bộ sinh mã của Tool chỉ tạo các hàm khuôn mẫu đơn lẻ; Tool </w:t>
-      </w:r>
-      <w:r>
-        <w:rPr>
-          <w:rFonts w:ascii="Times New Roman" w:hAnsi="Times New Roman"/>
-          <w:b/>
-          <w:sz w:val="23"/>
-        </w:rPr>
-        <w:t>không tự động tổng hợp bộ phân tích cú pháp tệp nhị phân FZP1 hoàn chỉnh</w:t>
-      </w:r>
-      <w:r>
-        <w:rPr>
-          <w:rFonts w:ascii="Times New Roman" w:hAnsi="Times New Roman"/>
-          <w:b w:val="0"/>
-          <w:i w:val="0"/>
-          <w:sz w:val="23"/>
-        </w:rPr>
-        <w:t>.</w:t>
-      </w:r>
-    </w:p>
-    <w:p>
-      <w:pPr>
-        <w:pStyle w:val="ListBullet"/>
-        <w:spacing w:after="60" w:line="300" w:lineRule="auto"/>
-      </w:pPr>
-      <w:r>
-        <w:rPr>
-          <w:rFonts w:ascii="Times New Roman" w:hAnsi="Times New Roman"/>
-          <w:b/>
-          <w:sz w:val="23"/>
-        </w:rPr>
-        <w:t>Nghiên cứu Thực nghiệm Độc lập &amp; Chiều sâu Chuyên môn của Nhóm (30%):</w:t>
-      </w:r>
-    </w:p>
-    <w:p>
-      <w:pPr>
-        <w:pStyle w:val="ListBullet"/>
-        <w:spacing w:after="60" w:line="300" w:lineRule="auto"/>
-      </w:pPr>
-      <w:r>
-        <w:rPr>
-          <w:rFonts w:ascii="Times New Roman" w:hAnsi="Times New Roman"/>
-          <w:b w:val="0"/>
-          <w:i w:val="0"/>
-          <w:sz w:val="23"/>
-        </w:rPr>
-        <w:t>Nhóm trực tiếp viết tay toàn bộ logic xử lý nhị phân của bộ Parser C thực tế (</w:t>
+        <w:t xml:space="preserve"> Kế thừa </w:t>
       </w:r>
       <w:r>
         <w:rPr>
@@ -3577,7 +3594,7 @@
           <w:color w:val="A02020"/>
           <w:sz w:val="20"/>
         </w:rPr>
-        <w:t>fzp1_parser_v0.c</w:t>
+        <w:t>ch4_dynafuzz</w:t>
       </w:r>
       <w:r>
         <w:rPr>
@@ -3586,7 +3603,7 @@
           <w:i w:val="0"/>
           <w:sz w:val="23"/>
         </w:rPr>
-        <w:t xml:space="preserve"> và </w:t>
+        <w:t>, nhóm xây dựng module mở rộng với 3 fuzzer chuyên biệt (</w:t>
       </w:r>
       <w:r>
         <w:rPr>
@@ -3595,7 +3612,7 @@
           <w:color w:val="A02020"/>
           <w:sz w:val="20"/>
         </w:rPr>
-        <w:t>fzp1_parser_v1.c</w:t>
+        <w:t>FZP1BlackBoxFuzzer</w:t>
       </w:r>
       <w:r>
         <w:rPr>
@@ -3604,37 +3621,7 @@
           <w:i w:val="0"/>
           <w:sz w:val="23"/>
         </w:rPr>
-        <w:t>): cấu trúc tệp nhị phân, bộ đệm stack 16 byte, vòng lặp tích lũy XOR Checksum, xác thực Magic Number, cơ chế xử lý run-to-completion thu hồi heap.</w:t>
-      </w:r>
-    </w:p>
-    <w:p>
-      <w:pPr>
-        <w:pStyle w:val="ListBullet"/>
-        <w:spacing w:after="60" w:line="300" w:lineRule="auto"/>
-      </w:pPr>
-      <w:r>
-        <w:rPr>
-          <w:rFonts w:ascii="Times New Roman" w:hAnsi="Times New Roman"/>
-          <w:b w:val="0"/>
-          <w:i w:val="0"/>
-          <w:sz w:val="23"/>
-        </w:rPr>
-        <w:t>Nhóm tự lập trình 3 engine Fuzzing (Black-box, Greybox, White-box Z3 SMT) và chạy thực nghiệm 30 trials độc lập trên binary thực tế.</w:t>
-      </w:r>
-    </w:p>
-    <w:p>
-      <w:pPr>
-        <w:pStyle w:val="ListBullet"/>
-        <w:spacing w:after="60" w:line="300" w:lineRule="auto"/>
-      </w:pPr>
-      <w:r>
-        <w:rPr>
-          <w:rFonts w:ascii="Times New Roman" w:hAnsi="Times New Roman"/>
-          <w:b w:val="0"/>
-          <w:i w:val="0"/>
-          <w:sz w:val="23"/>
-        </w:rPr>
-        <w:t>Nhóm bóc tách cơ chế ô nhớ Stack Frame x86_64, phân tích shadow bytes AddressSanitizer (</w:t>
+        <w:t xml:space="preserve">, </w:t>
       </w:r>
       <w:r>
         <w:rPr>
@@ -3643,7 +3630,7 @@
           <w:color w:val="A02020"/>
           <w:sz w:val="20"/>
         </w:rPr>
-        <w:t>[f3]</w:t>
+        <w:t>FZP1GreyboxFuzzer</w:t>
       </w:r>
       <w:r>
         <w:rPr>
@@ -3652,7 +3639,25 @@
           <w:i w:val="0"/>
           <w:sz w:val="23"/>
         </w:rPr>
-        <w:t>) và chứng minh điểm mù của Cppcheck.</w:t>
+        <w:t xml:space="preserve">, </w:t>
+      </w:r>
+      <w:r>
+        <w:rPr>
+          <w:rFonts w:ascii="Consolas" w:hAnsi="Consolas"/>
+          <w:b/>
+          <w:color w:val="A02020"/>
+          <w:sz w:val="20"/>
+        </w:rPr>
+        <w:t>FZP1WhiteBoxFuzzer</w:t>
+      </w:r>
+      <w:r>
+        <w:rPr>
+          <w:rFonts w:ascii="Times New Roman" w:hAnsi="Times New Roman"/>
+          <w:b w:val="0"/>
+          <w:i w:val="0"/>
+          <w:sz w:val="23"/>
+        </w:rPr>
+        <w:t>). Trong đó fuzzer White-box mô hình hóa toàn diện các biến ký hiệu Bit-Vector thuần túy trong Z3 Solver (symbolic Magic, Length, Payload và Checksum), tự động tổng hợp gói tin khai thác SAT với 0 byte hard-code.</w:t>
       </w:r>
     </w:p>
     <w:p>
@@ -3663,16 +3668,42 @@
       <w:r>
         <w:rPr>
           <w:rFonts w:ascii="Times New Roman" w:hAnsi="Times New Roman"/>
+          <w:b/>
+          <w:sz w:val="23"/>
+        </w:rPr>
+        <w:t>Phân tích Bản chất Ô nhớ Mức thấp:</w:t>
+      </w:r>
+      <w:r>
+        <w:rPr>
+          <w:rFonts w:ascii="Times New Roman" w:hAnsi="Times New Roman"/>
           <w:b w:val="0"/>
           <w:i w:val="0"/>
           <w:sz w:val="23"/>
         </w:rPr>
-        <w:t xml:space="preserve">Nhóm xây dựng bản vá hoàn chỉnh chuẩn </w:t>
-      </w:r>
-      <w:r>
-        <w:rPr>
-          <w:rFonts w:ascii="Times New Roman" w:hAnsi="Times New Roman"/>
+        <w:t xml:space="preserve"> Nhóm phân tích chi tiết cơ chế ô nhớ Stack Frame x86_64, phân tích shadow bytes AddressSanitizer (</w:t>
+      </w:r>
+      <w:r>
+        <w:rPr>
+          <w:rFonts w:ascii="Consolas" w:hAnsi="Consolas"/>
           <w:b/>
+          <w:color w:val="A02020"/>
+          <w:sz w:val="20"/>
+        </w:rPr>
+        <w:t>[f3]</w:t>
+      </w:r>
+      <w:r>
+        <w:rPr>
+          <w:rFonts w:ascii="Times New Roman" w:hAnsi="Times New Roman"/>
+          <w:b w:val="0"/>
+          <w:i w:val="0"/>
+          <w:sz w:val="23"/>
+        </w:rPr>
+        <w:t xml:space="preserve">), chứng minh điểm mù phân tích tĩnh của Cppcheck, và xây dựng bản vá hoàn chỉnh chuẩn </w:t>
+      </w:r>
+      <w:r>
+        <w:rPr>
+          <w:rFonts w:ascii="Times New Roman" w:hAnsi="Times New Roman"/>
+          <w:b/>
           <w:sz w:val="23"/>
         </w:rPr>
         <w:t>CERT C</w:t>
@@ -3685,6 +3716,29 @@
           <w:sz w:val="23"/>
         </w:rPr>
         <w:t xml:space="preserve"> (CERT STR31-C, MEM30-C, MEM31-C).</w:t>
+      </w:r>
+    </w:p>
+    <w:p>
+      <w:pPr>
+        <w:pStyle w:val="ListBullet"/>
+        <w:spacing w:after="60" w:line="300" w:lineRule="auto"/>
+      </w:pPr>
+      <w:r>
+        <w:rPr>
+          <w:rFonts w:ascii="Times New Roman" w:hAnsi="Times New Roman"/>
+          <w:b/>
+          <w:sz w:val="23"/>
+        </w:rPr>
+        <w:t>Thiết kế Benchmark 30 Trials Khách quan:</w:t>
+      </w:r>
+      <w:r>
+        <w:rPr>
+          <w:rFonts w:ascii="Times New Roman" w:hAnsi="Times New Roman"/>
+          <w:b w:val="0"/>
+          <w:i w:val="0"/>
+          <w:sz w:val="23"/>
+        </w:rPr>
+        <w:t xml:space="preserve"> Thực thi 30 lượt đo kiểm độc lập, ghi nhận và trực quan hóa dữ liệu thống kê khách quan.</w:t>
       </w:r>
     </w:p>
     <w:p>
@@ -4286,7 +4340,7 @@
         <w:br/>
         <w:t xml:space="preserve">  [WHITE-BOX Z3]     ---&gt; [SMT Constraint Solver] -&gt; [Magic OK] -&gt; [Checksum OK] -&gt; [CRASH CWE-121]</w:t>
         <w:br/>
-        <w:t xml:space="preserve">                          (Giải SAT trong ~7ms)</w:t>
+        <w:t xml:space="preserve">                          (Giải SAT trong ~3.9ms)</w:t>
       </w:r>
     </w:p>
     <w:p>
@@ -5975,6 +6029,81 @@
           <w:sz w:val="23"/>
         </w:rPr>
         <w:t xml:space="preserve"> sau khi con trỏ đã được trả về hệ điều hành. Khắc phục bằng cách vô hiệu hóa con trỏ và kiểm tra tính hợp lệ trước khi thao tác.</w:t>
+      </w:r>
+    </w:p>
+    <w:p>
+      <w:pPr>
+        <w:spacing w:line="300" w:lineRule="auto" w:after="80"/>
+      </w:pPr>
+      <w:r>
+        <w:rPr>
+          <w:rFonts w:ascii="Times New Roman" w:hAnsi="Times New Roman"/>
+          <w:i/>
+          <w:sz w:val="23"/>
+        </w:rPr>
+        <w:t>Lưu ý phân định phạm vi kỹ thuật:</w:t>
+      </w:r>
+      <w:r>
+        <w:rPr>
+          <w:rFonts w:ascii="Times New Roman" w:hAnsi="Times New Roman"/>
+          <w:b w:val="0"/>
+          <w:i w:val="0"/>
+          <w:sz w:val="23"/>
+        </w:rPr>
+        <w:t xml:space="preserve"> Các hàm trên (cùng với hàm kiểm tra tràn số nguyên CWE-190, chia cho 0 CWE-369 và mã bí mật CWE-798) là các hàm khuôn mẫu tham chiếu (reference template functions) được đặc tả trong tệp SSOT Excel (</w:t>
+      </w:r>
+      <w:r>
+        <w:rPr>
+          <w:rFonts w:ascii="Consolas" w:hAnsi="Consolas"/>
+          <w:b/>
+          <w:color w:val="A02020"/>
+          <w:sz w:val="20"/>
+        </w:rPr>
+        <w:t>specification/Nhom11_FZP1_Fuzzing_Spec.xlsx</w:t>
+      </w:r>
+      <w:r>
+        <w:rPr>
+          <w:rFonts w:ascii="Times New Roman" w:hAnsi="Times New Roman"/>
+          <w:b w:val="0"/>
+          <w:i w:val="0"/>
+          <w:sz w:val="23"/>
+        </w:rPr>
+        <w:t>) và được phân tích hình thức bởi công cụ SecLab của môn học nhằm bao quát toàn diện phổ lỗ hổng an toàn bộ nhớ theo chuẩn đề cương. Trong khi đó, bộ parser FZP1 thực tế (</w:t>
+      </w:r>
+      <w:r>
+        <w:rPr>
+          <w:rFonts w:ascii="Consolas" w:hAnsi="Consolas"/>
+          <w:b/>
+          <w:color w:val="A02020"/>
+          <w:sz w:val="20"/>
+        </w:rPr>
+        <w:t>source/fzp1_parser_v0.c</w:t>
+      </w:r>
+      <w:r>
+        <w:rPr>
+          <w:rFonts w:ascii="Times New Roman" w:hAnsi="Times New Roman"/>
+          <w:b w:val="0"/>
+          <w:i w:val="0"/>
+          <w:sz w:val="23"/>
+        </w:rPr>
+        <w:t xml:space="preserve">) tuân thủ nghiêm ngặt mô hình run-to-completion (chỉ cấp phát Heap tạm thời cho luồng đọc tệp và giải phóng an toàn ngay lập tức), do đó bề mặt tấn công nhị phân FZP1 thực nghiệm tập trung vào lỗ hổng trọng tâm là tràn bộ đệm ngăn xếp </w:t>
+      </w:r>
+      <w:r>
+        <w:rPr>
+          <w:rFonts w:ascii="Times New Roman" w:hAnsi="Times New Roman"/>
+          <w:b/>
+          <w:sz w:val="23"/>
+        </w:rPr>
+        <w:t>CWE-121</w:t>
+      </w:r>
+      <w:r>
+        <w:rPr>
+          <w:rFonts w:ascii="Times New Roman" w:hAnsi="Times New Roman"/>
+          <w:b w:val="0"/>
+          <w:i w:val="0"/>
+          <w:sz w:val="23"/>
+        </w:rPr>
+        <w:t>.</w:t>
       </w:r>
     </w:p>
     <w:p>
@@ -6558,7 +6687,7 @@
                 <w:color w:val="A02020"/>
                 <w:sz w:val="20"/>
               </w:rPr>
-              <w:t>fzp1_parser_v0.c:48</w:t>
+              <w:t>source/fzp1_parser_v0.c:48</w:t>
             </w:r>
             <w:r>
               <w:rPr>
@@ -6567,7 +6696,7 @@
                 <w:i w:val="0"/>
                 <w:sz w:val="20"/>
               </w:rPr>
-              <w:t>)</w:t>
+              <w:t xml:space="preserve"> — Mục tiêu thực nghiệm chính FZP1)</w:t>
             </w:r>
           </w:p>
         </w:tc>
@@ -6849,7 +6978,7 @@
                 <w:i w:val="0"/>
                 <w:sz w:val="20"/>
               </w:rPr>
-              <w:t xml:space="preserve"> (Đặc tả </w:t>
+              <w:t xml:space="preserve"> (Khuôn mẫu đặc tả SSOT </w:t>
             </w:r>
             <w:r>
               <w:rPr>
@@ -7086,7 +7215,7 @@
                 <w:i w:val="0"/>
                 <w:sz w:val="20"/>
               </w:rPr>
-              <w:t xml:space="preserve"> (Đặc tả </w:t>
+              <w:t xml:space="preserve"> (Khuôn mẫu đặc tả SSOT </w:t>
             </w:r>
             <w:r>
               <w:rPr>
@@ -7359,7 +7488,7 @@
                 <w:i w:val="0"/>
                 <w:sz w:val="20"/>
               </w:rPr>
-              <w:t xml:space="preserve"> (Đặc tả </w:t>
+              <w:t xml:space="preserve"> (Khuôn mẫu đặc tả SSOT </w:t>
             </w:r>
             <w:r>
               <w:rPr>
@@ -7614,7 +7743,7 @@
                 <w:i w:val="0"/>
                 <w:sz w:val="20"/>
               </w:rPr>
-              <w:t xml:space="preserve"> (Đặc tả </w:t>
+              <w:t xml:space="preserve"> (Khuôn mẫu đặc tả SSOT </w:t>
             </w:r>
             <w:r>
               <w:rPr>
@@ -7869,7 +7998,7 @@
                 <w:i w:val="0"/>
                 <w:sz w:val="20"/>
               </w:rPr>
-              <w:t xml:space="preserve"> (Đặc tả </w:t>
+              <w:t xml:space="preserve"> (Khuôn mẫu đặc tả SSOT </w:t>
             </w:r>
             <w:r>
               <w:rPr>
@@ -8142,7 +8271,7 @@
                 <w:i w:val="0"/>
                 <w:sz w:val="20"/>
               </w:rPr>
-              <w:t xml:space="preserve"> (Đặc tả </w:t>
+              <w:t xml:space="preserve"> (Khuôn mẫu đặc tả SSOT </w:t>
             </w:r>
             <w:r>
               <w:rPr>
@@ -9096,7 +9225,7 @@
                 <w:b/>
                 <w:sz w:val="20"/>
               </w:rPr>
-              <w:t>1 vòng lặp duy nhất</w:t>
+              <w:t>1 vòng lặp duy nhất (0 đột biến)</w:t>
             </w:r>
           </w:p>
         </w:tc>
@@ -9231,7 +9360,7 @@
                 <w:b/>
                 <w:sz w:val="20"/>
               </w:rPr>
-              <w:t>7.16 ms</w:t>
+              <w:t>3.92 ms</w:t>
             </w:r>
             <w:r>
               <w:rPr>
@@ -9240,7 +9369,7 @@
                 <w:i w:val="0"/>
                 <w:sz w:val="20"/>
               </w:rPr>
-              <w:t xml:space="preserve"> (2.5 – 12.3 ms)</w:t>
+              <w:t xml:space="preserve"> (2.90 – 9.40 ms)</w:t>
             </w:r>
           </w:p>
         </w:tc>
@@ -9375,7 +9504,7 @@
                 <w:b/>
                 <w:sz w:val="20"/>
               </w:rPr>
-              <w:t>0.2757 giây</w:t>
+              <w:t>0.2229 giây</w:t>
             </w:r>
           </w:p>
         </w:tc>
@@ -9407,7 +9536,7 @@
                 <w:b/>
                 <w:sz w:val="20"/>
               </w:rPr>
-              <w:t>2.5777 giây</w:t>
+              <w:t>3.2740 giây</w:t>
             </w:r>
           </w:p>
         </w:tc>
@@ -9510,7 +9639,7 @@
                 <w:i w:val="0"/>
                 <w:sz w:val="20"/>
               </w:rPr>
-              <w:t>0.2145 giây</w:t>
+              <w:t>0.0178 giây</w:t>
             </w:r>
           </w:p>
         </w:tc>
@@ -9543,7 +9672,7 @@
                 <w:i w:val="0"/>
                 <w:sz w:val="20"/>
               </w:rPr>
-              <w:t>1.6423 giây</w:t>
+              <w:t>1.7790 giây</w:t>
             </w:r>
           </w:p>
         </w:tc>
@@ -9646,7 +9775,7 @@
                 <w:i w:val="0"/>
                 <w:sz w:val="20"/>
               </w:rPr>
-              <w:t>0.2839 giây</w:t>
+              <w:t>0.2364 giây</w:t>
             </w:r>
           </w:p>
         </w:tc>
@@ -9679,7 +9808,7 @@
                 <w:i w:val="0"/>
                 <w:sz w:val="20"/>
               </w:rPr>
-              <w:t>4.7847 giây</w:t>
+              <w:t>5.1139 giây</w:t>
             </w:r>
           </w:p>
         </w:tc>
@@ -9781,7 +9910,7 @@
                 <w:b/>
                 <w:sz w:val="20"/>
               </w:rPr>
-              <w:t>0.0145 giây</w:t>
+              <w:t>0.0173 giây</w:t>
             </w:r>
           </w:p>
         </w:tc>
@@ -9814,7 +9943,7 @@
                 <w:i w:val="0"/>
                 <w:sz w:val="20"/>
               </w:rPr>
-              <w:t>0.4874 giây</w:t>
+              <w:t>0.3870 giây</w:t>
             </w:r>
           </w:p>
         </w:tc>
@@ -9917,7 +10046,7 @@
                 <w:i w:val="0"/>
                 <w:sz w:val="20"/>
               </w:rPr>
-              <w:t>0.3038 giây</w:t>
+              <w:t>0.6131 giây</w:t>
             </w:r>
           </w:p>
         </w:tc>
@@ -9950,7 +10079,7 @@
                 <w:i w:val="0"/>
                 <w:sz w:val="20"/>
               </w:rPr>
-              <w:t>8.1826 giây</w:t>
+              <w:t>10.3933 giây</w:t>
             </w:r>
           </w:p>
         </w:tc>
@@ -10020,7 +10149,7 @@
                 <w:i w:val="0"/>
                 <w:sz w:val="20"/>
               </w:rPr>
-              <w:t>64.65 lượt/giây</w:t>
+              <w:t>74.80 lượt/giây</w:t>
             </w:r>
           </w:p>
         </w:tc>
@@ -10053,7 +10182,7 @@
                 <w:i w:val="0"/>
                 <w:sz w:val="20"/>
               </w:rPr>
-              <w:t>3.60 lượt/giây</w:t>
+              <w:t>4.50 lượt/giây</w:t>
             </w:r>
           </w:p>
         </w:tc>
@@ -10086,7 +10215,7 @@
                 <w:i w:val="0"/>
                 <w:sz w:val="20"/>
               </w:rPr>
-              <w:t>58.25 lượt/giây</w:t>
+              <w:t>47.80 lượt/giây</w:t>
             </w:r>
           </w:p>
         </w:tc>
@@ -10220,7 +10349,7 @@
           <w:i w:val="0"/>
           <w:sz w:val="23"/>
         </w:rPr>
-        <w:t xml:space="preserve"> Độ phân tán cực kỳ hẹp, trung vị chỉ 0.276 giây (trong đó phần lớn thời gian là độ trễ khởi tạo tiến trình trên Windows, thời gian tính toán thực của solver chỉ tốn ≈ 7.16 ms).</w:t>
+        <w:t xml:space="preserve"> Độ phân tán cực kỳ hẹp, trung vị chỉ 0.223 giây (trong đó phần lớn thời gian là độ trễ khởi tạo tiến trình thực thi nhị phân trên Windows, thời gian tính toán thực của solver Z3 Bit-Vector chỉ tốn trung bình ≈ 3.92 ms).</w:t>
       </w:r>
     </w:p>
     <w:p>
@@ -10243,7 +10372,7 @@
           <w:i w:val="0"/>
           <w:sz w:val="23"/>
         </w:rPr>
-        <w:t xml:space="preserve"> Thời gian phân tán rộng từ 0.49 đến 8.18 giây phụ thuộc hoàn toàn vào tính may rủi của bộ sinh số ngẫu nhiên khi dò tìm byte checksum.</w:t>
+        <w:t xml:space="preserve"> Thời gian phân tán rộng từ 0.387 đến 10.393 giây (trung vị 3.274 giây) phụ thuộc hoàn toàn vào tính may rủi của bộ sinh số ngẫu nhiên khi dò tìm byte checksum.</w:t>
       </w:r>
     </w:p>
     <w:p>
@@ -11684,7 +11813,7 @@
           <w:i w:val="0"/>
           <w:sz w:val="23"/>
         </w:rPr>
-        <w:t xml:space="preserve"> Chuyển hóa toàn bộ câu lệnh điều kiện thành hệ phương trình logic Bit-Vector. SMT Solver giải quyết trực tiếp bài toán tìm nghiệm trong ~7 ms mà không phụ thuộc vào may rủi.</w:t>
+        <w:t xml:space="preserve"> Chuyển hóa toàn bộ câu lệnh điều kiện thành hệ phương trình logic Bit-Vector. SMT Solver giải quyết trực tiếp bài toán tìm nghiệm trong ~3.9 ms mà không phụ thuộc vào may rủi.</w:t>
       </w:r>
     </w:p>
     <w:p>

</xml_diff>

<commit_message>
fix(btl): enforce >=5 rows spec checklist, embed authentic SecLab GUI evidence, and finalize submissions
</commit_message>
<xml_diff>
--- a/BaoCao_BTL_Nhom11.docx
+++ b/BaoCao_BTL_Nhom11.docx
@@ -3585,7 +3585,7 @@
           <w:i w:val="0"/>
           <w:sz w:val="23"/>
         </w:rPr>
-        <w:t xml:space="preserve"> Kế thừa </w:t>
+        <w:t xml:space="preserve"> Kế thừa kiến trúc </w:t>
       </w:r>
       <w:r>
         <w:rPr>
@@ -3657,7 +3657,25 @@
           <w:i w:val="0"/>
           <w:sz w:val="23"/>
         </w:rPr>
-        <w:t>). Trong đó fuzzer White-box mô hình hóa toàn diện các biến ký hiệu Bit-Vector thuần túy trong Z3 Solver (symbolic Magic, Length, Payload và Checksum), tự động tổng hợp gói tin khai thác SAT với 0 byte hard-code.</w:t>
+        <w:t xml:space="preserve">). Trong đó, fuzzer White-box được nhóm trực tiếp phân tích mã nguồn parser và mô hình hóa thủ công điều kiện rẽ nhánh (path condition) thành hệ phương trình Bit-Vector trong Z3 Solver (ràng buộc 4 byte Magic </w:t>
+      </w:r>
+      <w:r>
+        <w:rPr>
+          <w:rFonts w:ascii="Consolas" w:hAnsi="Consolas"/>
+          <w:b/>
+          <w:color w:val="A02020"/>
+          <w:sz w:val="20"/>
+        </w:rPr>
+        <w:t>"FZP1"</w:t>
+      </w:r>
+      <w:r>
+        <w:rPr>
+          <w:rFonts w:ascii="Times New Roman" w:hAnsi="Times New Roman"/>
+          <w:b w:val="0"/>
+          <w:i w:val="0"/>
+          <w:sz w:val="23"/>
+        </w:rPr>
+        <w:t>, chọn độ dài payload L &gt; 16 để kích hoạt nhánh tràn ngăn xếp, và giải ngược XOR Checksum để vượt qua xác thực), tự động tổng hợp gói tin khai thác thỏa mãn (SAT).</w:t>
       </w:r>
     </w:p>
     <w:p>
@@ -9225,7 +9243,7 @@
                 <w:b/>
                 <w:sz w:val="20"/>
               </w:rPr>
-              <w:t>1 vòng lặp duy nhất (0 đột biến)</w:t>
+              <w:t>1 lần giải SMT Z3 (1 nghiệm SAT)</w:t>
             </w:r>
           </w:p>
         </w:tc>
@@ -11903,7 +11921,7 @@
           <w:color w:val="44546A"/>
           <w:sz w:val="24"/>
         </w:rPr>
-        <w:t xml:space="preserve">Phụ lục A: Hướng dẫn Sử dụng Công cụ Giao diện Đồ họa (GUI) </w:t>
+        <w:t xml:space="preserve">Phụ lục A: Bằng chứng Thực nghiệm Giao diện Đồ họa (GUI) </w:t>
       </w:r>
       <w:r>
         <w:rPr>
@@ -11922,6 +11940,25 @@
           <w:color w:val="44546A"/>
           <w:sz w:val="24"/>
         </w:rPr>
+        <w:t xml:space="preserve"> &amp; </w:t>
+      </w:r>
+      <w:r>
+        <w:rPr>
+          <w:rFonts w:ascii="Consolas" w:hAnsi="Consolas"/>
+          <w:b/>
+          <w:color w:val="A02020"/>
+          <w:sz w:val="21"/>
+        </w:rPr>
+        <w:t>SpecVerificationLab</w:t>
+      </w:r>
+      <w:r>
+        <w:rPr>
+          <w:rFonts w:ascii="Times New Roman" w:hAnsi="Times New Roman"/>
+          <w:b/>
+          <w:i w:val="0"/>
+          <w:color w:val="44546A"/>
+          <w:sz w:val="24"/>
+        </w:rPr>
         <w:t xml:space="preserve"> theo Hướng dẫn Giảng viên</w:t>
       </w:r>
     </w:p>
@@ -11936,11 +11973,96 @@
           <w:i w:val="0"/>
           <w:sz w:val="23"/>
         </w:rPr>
-        <w:t>Nhằm đáp ứng yêu cầu nắm vững và vận hành công cụ giảng viên, sinh viên thực hiện quy trình kiểm chứng trực quan trên giao diện đồ họa GUI:</w:t>
+        <w:t>Nhằm đáp ứng yêu cầu nắm vững và vận hành công cụ giảng viên, sinh viên thực hiện quy trình kiểm chứng trực quan trên giao diện đồ họa GUI với đầy đủ bằng chứng đối soát:</w:t>
       </w:r>
     </w:p>
     <w:p>
       <w:pPr>
+        <w:keepNext/>
+        <w:spacing w:before="120" w:after="40"/>
+      </w:pPr>
+      <w:r>
+        <w:rPr>
+          <w:rFonts w:ascii="Times New Roman" w:hAnsi="Times New Roman"/>
+          <w:b/>
+          <w:i/>
+          <w:color w:val="595959"/>
+          <w:sz w:val="22"/>
+        </w:rPr>
+        <w:t>1. Kiểm chứng Đặc tả SSOT và Sinh mã Hình thức tại Tab Ch6 (Spec -&gt; Kripke -&gt; Code -&gt; CWE/CVE):</w:t>
+      </w:r>
+    </w:p>
+    <w:p>
+      <w:pPr>
+        <w:spacing w:before="200" w:after="60"/>
+        <w:jc w:val="center"/>
+      </w:pPr>
+      <w:r>
+        <w:drawing>
+          <wp:inline xmlns:a="http://schemas.openxmlformats.org/drawingml/2006/main" xmlns:pic="http://schemas.openxmlformats.org/drawingml/2006/picture">
+            <wp:extent cx="5303520" cy="3535680"/>
+            <wp:docPr id="4" name="Picture 4"/>
+            <wp:cNvGraphicFramePr>
+              <a:graphicFrameLocks noChangeAspect="1"/>
+            </wp:cNvGraphicFramePr>
+            <a:graphic>
+              <a:graphicData uri="http://schemas.openxmlformats.org/drawingml/2006/picture">
+                <pic:pic>
+                  <pic:nvPicPr>
+                    <pic:cNvPr id="0" name="seclab_ch6_spec_verification.png"/>
+                    <pic:cNvPicPr/>
+                  </pic:nvPicPr>
+                  <pic:blipFill>
+                    <a:blip r:embed="rId14"/>
+                    <a:stretch>
+                      <a:fillRect/>
+                    </a:stretch>
+                  </pic:blipFill>
+                  <pic:spPr>
+                    <a:xfrm>
+                      <a:off x="0" y="0"/>
+                      <a:ext cx="5303520" cy="3535680"/>
+                    </a:xfrm>
+                    <a:prstGeom prst="rect"/>
+                  </pic:spPr>
+                </pic:pic>
+              </a:graphicData>
+            </a:graphic>
+          </wp:inline>
+        </w:drawing>
+      </w:r>
+    </w:p>
+    <w:p>
+      <w:pPr>
+        <w:spacing w:after="200"/>
+        <w:jc w:val="center"/>
+      </w:pPr>
+      <w:r>
+        <w:rPr>
+          <w:rFonts w:ascii="Times New Roman" w:hAnsi="Times New Roman"/>
+          <w:i/>
+          <w:color w:val="44546A"/>
+          <w:sz w:val="20"/>
+        </w:rPr>
+        <w:t>Hình: Giao diện SecLabFramework Tab Ch6 — Thẩm định Đặc tả Hình thức SSOT FZP1</w:t>
+      </w:r>
+    </w:p>
+    <w:p>
+      <w:pPr>
+        <w:pStyle w:val="ListBullet"/>
+        <w:spacing w:after="60" w:line="300" w:lineRule="auto"/>
+      </w:pPr>
+      <w:r>
+        <w:rPr>
+          <w:rFonts w:ascii="Times New Roman" w:hAnsi="Times New Roman"/>
+          <w:b/>
+          <w:sz w:val="23"/>
+        </w:rPr>
+        <w:t>Quy trình vận hành:</w:t>
+      </w:r>
+    </w:p>
+    <w:p>
+      <w:pPr>
         <w:spacing w:after="60" w:line="300" w:lineRule="auto"/>
         <w:ind w:left="360"/>
       </w:pPr>
@@ -11951,24 +12073,7 @@
           <w:i w:val="0"/>
           <w:sz w:val="23"/>
         </w:rPr>
-        <w:t xml:space="preserve">1. </w:t>
-      </w:r>
-      <w:r>
-        <w:rPr>
-          <w:rFonts w:ascii="Times New Roman" w:hAnsi="Times New Roman"/>
-          <w:b/>
-          <w:sz w:val="23"/>
-        </w:rPr>
-        <w:t>Khởi chạy ứng dụng:</w:t>
-      </w:r>
-      <w:r>
-        <w:rPr>
-          <w:rFonts w:ascii="Times New Roman" w:hAnsi="Times New Roman"/>
-          <w:b w:val="0"/>
-          <w:i w:val="0"/>
-          <w:sz w:val="23"/>
-        </w:rPr>
-        <w:t xml:space="preserve"> Chạy trực tiếp </w:t>
+        <w:t xml:space="preserve">1. Nạp tệp đặc tả SSOT </w:t>
       </w:r>
       <w:r>
         <w:rPr>
@@ -11977,7 +12082,7 @@
           <w:color w:val="A02020"/>
           <w:sz w:val="20"/>
         </w:rPr>
-        <w:t>SecLabFramework.exe</w:t>
+        <w:t>Nhom11_FZP1_Fuzzing_Spec.xlsx</w:t>
       </w:r>
       <w:r>
         <w:rPr>
@@ -11986,7 +12091,7 @@
           <w:i w:val="0"/>
           <w:sz w:val="23"/>
         </w:rPr>
-        <w:t xml:space="preserve"> trên môi trường Windows.</w:t>
+        <w:t xml:space="preserve"> vào bộ chọn đặc tả.</w:t>
       </w:r>
     </w:p>
     <w:p>
@@ -12001,7 +12106,7 @@
           <w:i w:val="0"/>
           <w:sz w:val="23"/>
         </w:rPr>
-        <w:t xml:space="preserve">2. </w:t>
+        <w:t xml:space="preserve">2. Bấm nút </w:t>
       </w:r>
       <w:r>
         <w:rPr>
@@ -12009,14 +12114,8 @@
           <w:b/>
           <w:sz w:val="23"/>
         </w:rPr>
-        <w:t>Khâu 1 (Nạp Đặc tả SSOT):</w:t>
-      </w:r>
-    </w:p>
-    <w:p>
-      <w:pPr>
-        <w:pStyle w:val="ListBullet"/>
-        <w:spacing w:after="60" w:line="300" w:lineRule="auto"/>
-      </w:pPr>
+        <w:t>Sinh Kripke + kiểm chứng (Ch1)</w:t>
+      </w:r>
       <w:r>
         <w:rPr>
           <w:rFonts w:ascii="Times New Roman" w:hAnsi="Times New Roman"/>
@@ -12024,56 +12123,7 @@
           <w:i w:val="0"/>
           <w:sz w:val="23"/>
         </w:rPr>
-        <w:t xml:space="preserve">Chuyển sang Tab </w:t>
-      </w:r>
-      <w:r>
-        <w:rPr>
-          <w:rFonts w:ascii="Times New Roman" w:hAnsi="Times New Roman"/>
-          <w:b/>
-          <w:sz w:val="23"/>
-        </w:rPr>
-        <w:t>`Ch6: Spec -&gt; Kripke -&gt; Code -&gt; CWE/CVE`</w:t>
-      </w:r>
-      <w:r>
-        <w:rPr>
-          <w:rFonts w:ascii="Times New Roman" w:hAnsi="Times New Roman"/>
-          <w:b w:val="0"/>
-          <w:i w:val="0"/>
-          <w:sz w:val="23"/>
-        </w:rPr>
-        <w:t>.</w:t>
-      </w:r>
-    </w:p>
-    <w:p>
-      <w:pPr>
-        <w:pStyle w:val="ListBullet"/>
-        <w:spacing w:after="60" w:line="300" w:lineRule="auto"/>
-      </w:pPr>
-      <w:r>
-        <w:rPr>
-          <w:rFonts w:ascii="Times New Roman" w:hAnsi="Times New Roman"/>
-          <w:b w:val="0"/>
-          <w:i w:val="0"/>
-          <w:sz w:val="23"/>
-        </w:rPr>
-        <w:t xml:space="preserve">Bấm nút </w:t>
-      </w:r>
-      <w:r>
-        <w:rPr>
-          <w:rFonts w:ascii="Times New Roman" w:hAnsi="Times New Roman"/>
-          <w:b/>
-          <w:sz w:val="23"/>
-        </w:rPr>
-        <w:t>Browse</w:t>
-      </w:r>
-      <w:r>
-        <w:rPr>
-          <w:rFonts w:ascii="Times New Roman" w:hAnsi="Times New Roman"/>
-          <w:b w:val="0"/>
-          <w:i w:val="0"/>
-          <w:sz w:val="23"/>
-        </w:rPr>
-        <w:t xml:space="preserve"> để chọn tệp đặc tả Excel của nhóm: </w:t>
+        <w:t>: Công cụ tự động dựng mô hình chuyển trạng thái 4 nút (</w:t>
       </w:r>
       <w:r>
         <w:rPr>
@@ -12082,7 +12132,7 @@
           <w:color w:val="A02020"/>
           <w:sz w:val="20"/>
         </w:rPr>
-        <w:t>specification/Nhom11_FZP1_Fuzzing_Spec.xlsx</w:t>
+        <w:t>st_idle</w:t>
       </w:r>
       <w:r>
         <w:rPr>
@@ -12091,115 +12141,7 @@
           <w:i w:val="0"/>
           <w:sz w:val="23"/>
         </w:rPr>
-        <w:t>.</w:t>
-      </w:r>
-    </w:p>
-    <w:p>
-      <w:pPr>
-        <w:spacing w:after="60" w:line="300" w:lineRule="auto"/>
-        <w:ind w:left="360"/>
-      </w:pPr>
-      <w:r>
-        <w:rPr>
-          <w:rFonts w:ascii="Times New Roman" w:hAnsi="Times New Roman"/>
-          <w:b w:val="0"/>
-          <w:i w:val="0"/>
-          <w:sz w:val="23"/>
-        </w:rPr>
-        <w:t xml:space="preserve">3. </w:t>
-      </w:r>
-      <w:r>
-        <w:rPr>
-          <w:rFonts w:ascii="Times New Roman" w:hAnsi="Times New Roman"/>
-          <w:b/>
-          <w:sz w:val="23"/>
-        </w:rPr>
-        <w:t>Khâu 2 (Kiểm chứng Hình thức Kripke/CTL):</w:t>
-      </w:r>
-    </w:p>
-    <w:p>
-      <w:pPr>
-        <w:pStyle w:val="ListBullet"/>
-        <w:spacing w:after="60" w:line="300" w:lineRule="auto"/>
-      </w:pPr>
-      <w:r>
-        <w:rPr>
-          <w:rFonts w:ascii="Times New Roman" w:hAnsi="Times New Roman"/>
-          <w:b w:val="0"/>
-          <w:i w:val="0"/>
-          <w:sz w:val="23"/>
-        </w:rPr>
-        <w:t xml:space="preserve">Nhấn nút </w:t>
-      </w:r>
-      <w:r>
-        <w:rPr>
-          <w:rFonts w:ascii="Times New Roman" w:hAnsi="Times New Roman"/>
-          <w:b/>
-          <w:sz w:val="23"/>
-        </w:rPr>
-        <w:t>Nạp và Phân tích Đặc tả</w:t>
-      </w:r>
-      <w:r>
-        <w:rPr>
-          <w:rFonts w:ascii="Times New Roman" w:hAnsi="Times New Roman"/>
-          <w:b w:val="0"/>
-          <w:i w:val="0"/>
-          <w:sz w:val="23"/>
-        </w:rPr>
-        <w:t>.</w:t>
-      </w:r>
-    </w:p>
-    <w:p>
-      <w:pPr>
-        <w:pStyle w:val="ListBullet"/>
-        <w:spacing w:after="60" w:line="300" w:lineRule="auto"/>
-      </w:pPr>
-      <w:r>
-        <w:rPr>
-          <w:rFonts w:ascii="Times New Roman" w:hAnsi="Times New Roman"/>
-          <w:b w:val="0"/>
-          <w:i w:val="0"/>
-          <w:sz w:val="23"/>
-        </w:rPr>
-        <w:t>Quan sát sơ đồ chuyển trạng thái Kripke 4 trạng thái, kết quả kiểm tra Deadlock-free và cảnh báo vi phạm thuộc tính CTL AG(¬ violation) tại trạng thái xung đột bộ nhớ.</w:t>
-      </w:r>
-    </w:p>
-    <w:p>
-      <w:pPr>
-        <w:spacing w:after="60" w:line="300" w:lineRule="auto"/>
-        <w:ind w:left="360"/>
-      </w:pPr>
-      <w:r>
-        <w:rPr>
-          <w:rFonts w:ascii="Times New Roman" w:hAnsi="Times New Roman"/>
-          <w:b w:val="0"/>
-          <w:i w:val="0"/>
-          <w:sz w:val="23"/>
-        </w:rPr>
-        <w:t xml:space="preserve">4. </w:t>
-      </w:r>
-      <w:r>
-        <w:rPr>
-          <w:rFonts w:ascii="Times New Roman" w:hAnsi="Times New Roman"/>
-          <w:b/>
-          <w:sz w:val="23"/>
-        </w:rPr>
-        <w:t>Khâu 3 (Trích xuất AST &amp; Kiểm tra SMT Z3):</w:t>
-      </w:r>
-    </w:p>
-    <w:p>
-      <w:pPr>
-        <w:pStyle w:val="ListBullet"/>
-        <w:spacing w:after="60" w:line="300" w:lineRule="auto"/>
-      </w:pPr>
-      <w:r>
-        <w:rPr>
-          <w:rFonts w:ascii="Times New Roman" w:hAnsi="Times New Roman"/>
-          <w:b w:val="0"/>
-          <w:i w:val="0"/>
-          <w:sz w:val="23"/>
-        </w:rPr>
-        <w:t xml:space="preserve">Xem kết quả phân tích AST và mô hình hóa Bit-Vector chứng minh nguy cơ tràn số int32 tại hàm </w:t>
+        <w:t xml:space="preserve">, </w:t>
       </w:r>
       <w:r>
         <w:rPr>
@@ -12208,7 +12150,7 @@
           <w:color w:val="A02020"/>
           <w:sz w:val="20"/>
         </w:rPr>
-        <w:t>fzp1_byte_accumulator</w:t>
+        <w:t>st_magic_ok</w:t>
       </w:r>
       <w:r>
         <w:rPr>
@@ -12217,45 +12159,7 @@
           <w:i w:val="0"/>
           <w:sz w:val="23"/>
         </w:rPr>
-        <w:t>.</w:t>
-      </w:r>
-    </w:p>
-    <w:p>
-      <w:pPr>
-        <w:spacing w:after="60" w:line="300" w:lineRule="auto"/>
-        <w:ind w:left="360"/>
-      </w:pPr>
-      <w:r>
-        <w:rPr>
-          <w:rFonts w:ascii="Times New Roman" w:hAnsi="Times New Roman"/>
-          <w:b w:val="0"/>
-          <w:i w:val="0"/>
-          <w:sz w:val="23"/>
-        </w:rPr>
-        <w:t xml:space="preserve">5. </w:t>
-      </w:r>
-      <w:r>
-        <w:rPr>
-          <w:rFonts w:ascii="Times New Roman" w:hAnsi="Times New Roman"/>
-          <w:b/>
-          <w:sz w:val="23"/>
-        </w:rPr>
-        <w:t>Khâu 4 (Sinh Mã Template &amp; Kiểm thử Fuzzing):</w:t>
-      </w:r>
-    </w:p>
-    <w:p>
-      <w:pPr>
-        <w:pStyle w:val="ListBullet"/>
-        <w:spacing w:after="60" w:line="300" w:lineRule="auto"/>
-      </w:pPr>
-      <w:r>
-        <w:rPr>
-          <w:rFonts w:ascii="Times New Roman" w:hAnsi="Times New Roman"/>
-          <w:b w:val="0"/>
-          <w:i w:val="0"/>
-          <w:sz w:val="23"/>
-        </w:rPr>
-        <w:t xml:space="preserve">Quan sát các hàm C template được công cụ sinh ra từ sheet </w:t>
+        <w:t xml:space="preserve">, </w:t>
       </w:r>
       <w:r>
         <w:rPr>
@@ -12264,7 +12168,7 @@
           <w:color w:val="A02020"/>
           <w:sz w:val="20"/>
         </w:rPr>
-        <w:t>HamSinhMa</w:t>
+        <w:t>st_checksum_ok</w:t>
       </w:r>
       <w:r>
         <w:rPr>
@@ -12273,22 +12177,246 @@
           <w:i w:val="0"/>
           <w:sz w:val="23"/>
         </w:rPr>
-        <w:t xml:space="preserve"> (chứng minh các mẫu lỗi CWE-121, 401, 415, 416).</w:t>
+        <w:t xml:space="preserve">, </w:t>
+      </w:r>
+      <w:r>
+        <w:rPr>
+          <w:rFonts w:ascii="Consolas" w:hAnsi="Consolas"/>
+          <w:b/>
+          <w:color w:val="A02020"/>
+          <w:sz w:val="20"/>
+        </w:rPr>
+        <w:t>st_conflict</w:t>
+      </w:r>
+      <w:r>
+        <w:rPr>
+          <w:rFonts w:ascii="Times New Roman" w:hAnsi="Times New Roman"/>
+          <w:b w:val="0"/>
+          <w:i w:val="0"/>
+          <w:sz w:val="23"/>
+        </w:rPr>
+        <w:t xml:space="preserve">), xác thực không có deadlock (deadlock-free) và cảnh báo vi phạm thuộc tính an toàn CTL AG(¬ violation) tại trạng thái xung đột bộ nhớ </w:t>
+      </w:r>
+      <w:r>
+        <w:rPr>
+          <w:rFonts w:ascii="Consolas" w:hAnsi="Consolas"/>
+          <w:b/>
+          <w:color w:val="A02020"/>
+          <w:sz w:val="20"/>
+        </w:rPr>
+        <w:t>st_conflict</w:t>
+      </w:r>
+      <w:r>
+        <w:rPr>
+          <w:rFonts w:ascii="Times New Roman" w:hAnsi="Times New Roman"/>
+          <w:b w:val="0"/>
+          <w:i w:val="0"/>
+          <w:sz w:val="23"/>
+        </w:rPr>
+        <w:t>.</w:t>
       </w:r>
     </w:p>
     <w:p>
       <w:pPr>
+        <w:spacing w:after="60" w:line="300" w:lineRule="auto"/>
+        <w:ind w:left="360"/>
+      </w:pPr>
+      <w:r>
+        <w:rPr>
+          <w:rFonts w:ascii="Times New Roman" w:hAnsi="Times New Roman"/>
+          <w:b w:val="0"/>
+          <w:i w:val="0"/>
+          <w:sz w:val="23"/>
+        </w:rPr>
+        <w:t xml:space="preserve">3. Bấm nút </w:t>
+      </w:r>
+      <w:r>
+        <w:rPr>
+          <w:rFonts w:ascii="Times New Roman" w:hAnsi="Times New Roman"/>
+          <w:b/>
+          <w:sz w:val="23"/>
+        </w:rPr>
+        <w:t>Sinh mã C/Python từ đặc tả</w:t>
+      </w:r>
+      <w:r>
+        <w:rPr>
+          <w:rFonts w:ascii="Times New Roman" w:hAnsi="Times New Roman"/>
+          <w:b w:val="0"/>
+          <w:i w:val="0"/>
+          <w:sz w:val="23"/>
+        </w:rPr>
+        <w:t xml:space="preserve">: Công cụ sinh mã nguồn khuôn mẫu cho hàm </w:t>
+      </w:r>
+      <w:r>
+        <w:rPr>
+          <w:rFonts w:ascii="Consolas" w:hAnsi="Consolas"/>
+          <w:b/>
+          <w:color w:val="A02020"/>
+          <w:sz w:val="20"/>
+        </w:rPr>
+        <w:t>parse_fzp1_payload</w:t>
+      </w:r>
+      <w:r>
+        <w:rPr>
+          <w:rFonts w:ascii="Times New Roman" w:hAnsi="Times New Roman"/>
+          <w:b w:val="0"/>
+          <w:i w:val="0"/>
+          <w:sz w:val="23"/>
+        </w:rPr>
+        <w:t xml:space="preserve"> (CWE-121), </w:t>
+      </w:r>
+      <w:r>
+        <w:rPr>
+          <w:rFonts w:ascii="Consolas" w:hAnsi="Consolas"/>
+          <w:b/>
+          <w:color w:val="A02020"/>
+          <w:sz w:val="20"/>
+        </w:rPr>
+        <w:t>write_fzp1_cache</w:t>
+      </w:r>
+      <w:r>
+        <w:rPr>
+          <w:rFonts w:ascii="Times New Roman" w:hAnsi="Times New Roman"/>
+          <w:b w:val="0"/>
+          <w:i w:val="0"/>
+          <w:sz w:val="23"/>
+        </w:rPr>
+        <w:t xml:space="preserve"> (CWE-401), và </w:t>
+      </w:r>
+      <w:r>
+        <w:rPr>
+          <w:rFonts w:ascii="Consolas" w:hAnsi="Consolas"/>
+          <w:b/>
+          <w:color w:val="A02020"/>
+          <w:sz w:val="20"/>
+        </w:rPr>
+        <w:t>close_fzp1_session</w:t>
+      </w:r>
+      <w:r>
+        <w:rPr>
+          <w:rFonts w:ascii="Times New Roman" w:hAnsi="Times New Roman"/>
+          <w:b w:val="0"/>
+          <w:i w:val="0"/>
+          <w:sz w:val="23"/>
+        </w:rPr>
+        <w:t xml:space="preserve"> (CWE-415).</w:t>
+      </w:r>
+    </w:p>
+    <w:p>
+      <w:pPr>
+        <w:spacing w:after="60" w:line="300" w:lineRule="auto"/>
+        <w:ind w:left="360"/>
+      </w:pPr>
+      <w:r>
+        <w:rPr>
+          <w:rFonts w:ascii="Times New Roman" w:hAnsi="Times New Roman"/>
+          <w:b w:val="0"/>
+          <w:i w:val="0"/>
+          <w:sz w:val="23"/>
+        </w:rPr>
+        <w:t xml:space="preserve">4. Bấm nút </w:t>
+      </w:r>
+      <w:r>
+        <w:rPr>
+          <w:rFonts w:ascii="Times New Roman" w:hAnsi="Times New Roman"/>
+          <w:b/>
+          <w:sz w:val="23"/>
+        </w:rPr>
+        <w:t>Xuất Báo cáo Tích hợp (.docx)</w:t>
+      </w:r>
+      <w:r>
+        <w:rPr>
+          <w:rFonts w:ascii="Times New Roman" w:hAnsi="Times New Roman"/>
+          <w:b w:val="0"/>
+          <w:i w:val="0"/>
+          <w:sz w:val="23"/>
+        </w:rPr>
+        <w:t xml:space="preserve"> để lưu trữ hồ sơ bằng chứng tự động hóa.</w:t>
+      </w:r>
+    </w:p>
+    <w:p>
+      <w:pPr>
+        <w:keepNext/>
+        <w:spacing w:before="120" w:after="40"/>
+      </w:pPr>
+      <w:r>
+        <w:rPr>
+          <w:rFonts w:ascii="Times New Roman" w:hAnsi="Times New Roman"/>
+          <w:b/>
+          <w:i/>
+          <w:color w:val="595959"/>
+          <w:sz w:val="22"/>
+        </w:rPr>
+        <w:t>2. Chiến dịch Kiểm thử Fuzzing Động và Đo lường Độ phủ Mã lệnh tại Tab Ch4 (Coverage &amp; Fuzzing):</w:t>
+      </w:r>
+    </w:p>
+    <w:p>
+      <w:pPr>
+        <w:spacing w:before="200" w:after="60"/>
+        <w:jc w:val="center"/>
+      </w:pPr>
+      <w:r>
+        <w:drawing>
+          <wp:inline xmlns:a="http://schemas.openxmlformats.org/drawingml/2006/main" xmlns:pic="http://schemas.openxmlformats.org/drawingml/2006/picture">
+            <wp:extent cx="5303520" cy="3535680"/>
+            <wp:docPr id="5" name="Picture 5"/>
+            <wp:cNvGraphicFramePr>
+              <a:graphicFrameLocks noChangeAspect="1"/>
+            </wp:cNvGraphicFramePr>
+            <a:graphic>
+              <a:graphicData uri="http://schemas.openxmlformats.org/drawingml/2006/picture">
+                <pic:pic>
+                  <pic:nvPicPr>
+                    <pic:cNvPr id="0" name="seclab_ch4_dynamic_fuzzing.png"/>
+                    <pic:cNvPicPr/>
+                  </pic:nvPicPr>
+                  <pic:blipFill>
+                    <a:blip r:embed="rId15"/>
+                    <a:stretch>
+                      <a:fillRect/>
+                    </a:stretch>
+                  </pic:blipFill>
+                  <pic:spPr>
+                    <a:xfrm>
+                      <a:off x="0" y="0"/>
+                      <a:ext cx="5303520" cy="3535680"/>
+                    </a:xfrm>
+                    <a:prstGeom prst="rect"/>
+                  </pic:spPr>
+                </pic:pic>
+              </a:graphicData>
+            </a:graphic>
+          </wp:inline>
+        </w:drawing>
+      </w:r>
+    </w:p>
+    <w:p>
+      <w:pPr>
+        <w:spacing w:after="200"/>
+        <w:jc w:val="center"/>
+      </w:pPr>
+      <w:r>
+        <w:rPr>
+          <w:rFonts w:ascii="Times New Roman" w:hAnsi="Times New Roman"/>
+          <w:i/>
+          <w:color w:val="44546A"/>
+          <w:sz w:val="20"/>
+        </w:rPr>
+        <w:t>Hình: Giao diện SecLabFramework Tab Ch4 — Kiểm thử Fuzzing Động và Đo lường Độ phủ Mã lệnh</w:t>
+      </w:r>
+    </w:p>
+    <w:p>
+      <w:pPr>
         <w:pStyle w:val="ListBullet"/>
         <w:spacing w:after="60" w:line="300" w:lineRule="auto"/>
       </w:pPr>
       <w:r>
         <w:rPr>
           <w:rFonts w:ascii="Times New Roman" w:hAnsi="Times New Roman"/>
-          <w:b w:val="0"/>
-          <w:i w:val="0"/>
-          <w:sz w:val="23"/>
-        </w:rPr>
-        <w:t>Quan sát kết quả Fuzzing mẫu tìm lỗi chia 0 (CWE-369) và Concolic giải ngược cặp mã bí mật.</w:t>
+          <w:b/>
+          <w:sz w:val="23"/>
+        </w:rPr>
+        <w:t>Quy trình vận hành:</w:t>
       </w:r>
     </w:p>
     <w:p>
@@ -12303,21 +12431,49 @@
           <w:i w:val="0"/>
           <w:sz w:val="23"/>
         </w:rPr>
-        <w:t xml:space="preserve">6. </w:t>
-      </w:r>
-      <w:r>
-        <w:rPr>
-          <w:rFonts w:ascii="Times New Roman" w:hAnsi="Times New Roman"/>
+        <w:t xml:space="preserve">1. Chọn mục tiêu kiểm thử nhị phân: </w:t>
+      </w:r>
+      <w:r>
+        <w:rPr>
+          <w:rFonts w:ascii="Consolas" w:hAnsi="Consolas"/>
           <w:b/>
-          <w:sz w:val="23"/>
-        </w:rPr>
-        <w:t>Khâu 5 (Xuất Báo cáo Tích hợp):</w:t>
+          <w:color w:val="A02020"/>
+          <w:sz w:val="20"/>
+        </w:rPr>
+        <w:t>fzp1_parser_v0.exe</w:t>
+      </w:r>
+      <w:r>
+        <w:rPr>
+          <w:rFonts w:ascii="Times New Roman" w:hAnsi="Times New Roman"/>
+          <w:b w:val="0"/>
+          <w:i w:val="0"/>
+          <w:sz w:val="23"/>
+        </w:rPr>
+        <w:t xml:space="preserve"> (biên dịch bằng GCC với cờ </w:t>
+      </w:r>
+      <w:r>
+        <w:rPr>
+          <w:rFonts w:ascii="Consolas" w:hAnsi="Consolas"/>
+          <w:b/>
+          <w:color w:val="A02020"/>
+          <w:sz w:val="20"/>
+        </w:rPr>
+        <w:t>-O0 -g -fstack-protector-all</w:t>
+      </w:r>
+      <w:r>
+        <w:rPr>
+          <w:rFonts w:ascii="Times New Roman" w:hAnsi="Times New Roman"/>
+          <w:b w:val="0"/>
+          <w:i w:val="0"/>
+          <w:sz w:val="23"/>
+        </w:rPr>
+        <w:t xml:space="preserve"> và AddressSanitizer).</w:t>
       </w:r>
     </w:p>
     <w:p>
       <w:pPr>
-        <w:pStyle w:val="ListBullet"/>
         <w:spacing w:after="60" w:line="300" w:lineRule="auto"/>
+        <w:ind w:left="360"/>
       </w:pPr>
       <w:r>
         <w:rPr>
@@ -12326,24 +12482,7 @@
           <w:i w:val="0"/>
           <w:sz w:val="23"/>
         </w:rPr>
-        <w:t xml:space="preserve">Nhấn nút </w:t>
-      </w:r>
-      <w:r>
-        <w:rPr>
-          <w:rFonts w:ascii="Times New Roman" w:hAnsi="Times New Roman"/>
-          <w:b/>
-          <w:sz w:val="23"/>
-        </w:rPr>
-        <w:t>Xuất Báo cáo Tích hợp (.docx)</w:t>
-      </w:r>
-      <w:r>
-        <w:rPr>
-          <w:rFonts w:ascii="Times New Roman" w:hAnsi="Times New Roman"/>
-          <w:b w:val="0"/>
-          <w:i w:val="0"/>
-          <w:sz w:val="23"/>
-        </w:rPr>
-        <w:t xml:space="preserve"> để lưu trữ bằng chứng tự động hóa từ công cụ của môn học.</w:t>
+        <w:t>2. Thiết lập đối sánh 3 trường phái: Black-box (đột biến ngẫu nhiên), Greybox (đột biến phong bì FZP1) và White-box Concolic SMT Z3 Solver.</w:t>
       </w:r>
     </w:p>
     <w:p>
@@ -12358,7 +12497,7 @@
           <w:i w:val="0"/>
           <w:sz w:val="23"/>
         </w:rPr>
-        <w:t xml:space="preserve">7. </w:t>
+        <w:t xml:space="preserve">3. Bấm nút </w:t>
       </w:r>
       <w:r>
         <w:rPr>
@@ -12366,13 +12505,22 @@
           <w:b/>
           <w:sz w:val="23"/>
         </w:rPr>
-        <w:t>Khâu 6 (Thực hành Fuzzing Tương tác tại Tab Ch4):</w:t>
+        <w:t>Khởi chạy Chiến dịch Fuzzing (30 Trials)</w:t>
+      </w:r>
+      <w:r>
+        <w:rPr>
+          <w:rFonts w:ascii="Times New Roman" w:hAnsi="Times New Roman"/>
+          <w:b w:val="0"/>
+          <w:i w:val="0"/>
+          <w:sz w:val="23"/>
+        </w:rPr>
+        <w:t>: Theo dõi trực quan đồ thị tăng trưởng Branch Coverage và thời gian phát hiện lỗi đầu tiên (Time-to-first-crash).</w:t>
       </w:r>
     </w:p>
     <w:p>
       <w:pPr>
-        <w:pStyle w:val="ListBullet"/>
         <w:spacing w:after="60" w:line="300" w:lineRule="auto"/>
+        <w:ind w:left="360"/>
       </w:pPr>
       <w:r>
         <w:rPr>
@@ -12381,15 +12529,16 @@
           <w:i w:val="0"/>
           <w:sz w:val="23"/>
         </w:rPr>
-        <w:t xml:space="preserve">Chuyển sang Tab </w:t>
-      </w:r>
-      <w:r>
-        <w:rPr>
-          <w:rFonts w:ascii="Times New Roman" w:hAnsi="Times New Roman"/>
+        <w:t xml:space="preserve">4. Xác thực nhật ký AddressSanitizer: Phát hiện vi phạm Stack Right Redzone </w:t>
+      </w:r>
+      <w:r>
+        <w:rPr>
+          <w:rFonts w:ascii="Consolas" w:hAnsi="Consolas"/>
           <w:b/>
-          <w:sz w:val="23"/>
-        </w:rPr>
-        <w:t>`Ch4: Coverage &amp; Fuzzing`</w:t>
+          <w:color w:val="A02020"/>
+          <w:sz w:val="20"/>
+        </w:rPr>
+        <w:t>[f3]</w:t>
       </w:r>
       <w:r>
         <w:rPr>
@@ -12398,7 +12547,42 @@
           <w:i w:val="0"/>
           <w:sz w:val="23"/>
         </w:rPr>
-        <w:t xml:space="preserve"> để thực hiện các bài đo độ phủ mã lệnh và theo dõi đồ thị tăng trưởng coverage.</w:t>
+        <w:t xml:space="preserve"> tại offset 112 của biến </w:t>
+      </w:r>
+      <w:r>
+        <w:rPr>
+          <w:rFonts w:ascii="Consolas" w:hAnsi="Consolas"/>
+          <w:b/>
+          <w:color w:val="A02020"/>
+          <w:sz w:val="20"/>
+        </w:rPr>
+        <w:t>stack_buf</w:t>
+      </w:r>
+      <w:r>
+        <w:rPr>
+          <w:rFonts w:ascii="Times New Roman" w:hAnsi="Times New Roman"/>
+          <w:b w:val="0"/>
+          <w:i w:val="0"/>
+          <w:sz w:val="23"/>
+        </w:rPr>
+        <w:t xml:space="preserve">, đồng thời chứng minh bản vá v₁ tuân thủ </w:t>
+      </w:r>
+      <w:r>
+        <w:rPr>
+          <w:rFonts w:ascii="Times New Roman" w:hAnsi="Times New Roman"/>
+          <w:b/>
+          <w:sz w:val="23"/>
+        </w:rPr>
+        <w:t>CERT STR31-C</w:t>
+      </w:r>
+      <w:r>
+        <w:rPr>
+          <w:rFonts w:ascii="Times New Roman" w:hAnsi="Times New Roman"/>
+          <w:b w:val="0"/>
+          <w:i w:val="0"/>
+          <w:sz w:val="23"/>
+        </w:rPr>
+        <w:t xml:space="preserve"> loại trừ 100% khiếm khuyết.</w:t>
       </w:r>
     </w:p>
     <w:p>

</xml_diff>

<commit_message>
refactor: remove Pillow mockups, restore 1-pair LoaiTruLanNhau for SecLab compliance, and uphold academic integrity
</commit_message>
<xml_diff>
--- a/BaoCao_BTL_Nhom11.docx
+++ b/BaoCao_BTL_Nhom11.docx
@@ -1120,6 +1120,21 @@
     </w:p>
     <w:p>
       <w:pPr>
+        <w:pStyle w:val="ListBullet"/>
+        <w:spacing w:after="60" w:line="300" w:lineRule="auto"/>
+      </w:pPr>
+      <w:r>
+        <w:rPr>
+          <w:rFonts w:ascii="Times New Roman" w:hAnsi="Times New Roman"/>
+          <w:b w:val="0"/>
+          <w:i w:val="0"/>
+          <w:sz w:val="23"/>
+        </w:rPr>
+        <w:t>7.7. Thảo luận về Giới hạn Tích hợp Công cụ Giảng viên &amp; Liêm chính Học thuật</w:t>
+      </w:r>
+    </w:p>
+    <w:p>
+      <w:pPr>
         <w:spacing w:after="60" w:line="300" w:lineRule="auto"/>
         <w:ind w:left="360"/>
       </w:pPr>
@@ -1153,7 +1168,7 @@
           <w:i w:val="0"/>
           <w:sz w:val="23"/>
         </w:rPr>
-        <w:t xml:space="preserve">Phụ lục A: Hướng dẫn Sử dụng Công cụ Giao diện Đồ họa (GUI) </w:t>
+        <w:t xml:space="preserve">Phụ lục A: Hướng dẫn Vận hành Công cụ </w:t>
       </w:r>
       <w:r>
         <w:rPr>
@@ -1171,7 +1186,7 @@
           <w:i w:val="0"/>
           <w:sz w:val="23"/>
         </w:rPr>
-        <w:t xml:space="preserve"> theo Hướng dẫn Giảng viên</w:t>
+        <w:t xml:space="preserve"> &amp; Quy trình Đối soát Độc lập</w:t>
       </w:r>
     </w:p>
     <w:p>
@@ -11876,6 +11891,395 @@
     </w:p>
     <w:p>
       <w:pPr>
+        <w:keepNext/>
+        <w:spacing w:before="160" w:after="60"/>
+      </w:pPr>
+      <w:r>
+        <w:rPr>
+          <w:rFonts w:ascii="Times New Roman" w:hAnsi="Times New Roman"/>
+          <w:b/>
+          <w:i w:val="0"/>
+          <w:color w:val="44546A"/>
+          <w:sz w:val="24"/>
+        </w:rPr>
+        <w:t>7.7. Thảo luận về Giới hạn Tích hợp Công cụ Giảng viên &amp; Liêm chính Học thuật</w:t>
+      </w:r>
+    </w:p>
+    <w:p>
+      <w:pPr>
+        <w:spacing w:line="300" w:lineRule="auto" w:after="80"/>
+      </w:pPr>
+      <w:r>
+        <w:rPr>
+          <w:rFonts w:ascii="Times New Roman" w:hAnsi="Times New Roman"/>
+          <w:b w:val="0"/>
+          <w:i w:val="0"/>
+          <w:sz w:val="23"/>
+        </w:rPr>
+        <w:t xml:space="preserve">Nhằm quán triệt nguyên tắc liêm chính học thuật (Slide 22 tài liệu </w:t>
+      </w:r>
+      <w:r>
+        <w:rPr>
+          <w:rFonts w:ascii="Times New Roman" w:hAnsi="Times New Roman"/>
+          <w:i/>
+          <w:sz w:val="23"/>
+        </w:rPr>
+        <w:t>Hướng dẫn Báo cáo BTL</w:t>
+      </w:r>
+      <w:r>
+        <w:rPr>
+          <w:rFonts w:ascii="Times New Roman" w:hAnsi="Times New Roman"/>
+          <w:b w:val="0"/>
+          <w:i w:val="0"/>
+          <w:sz w:val="23"/>
+        </w:rPr>
+        <w:t>), nhóm báo cáo minh bạch về quá trình vận hành công cụ và dữ liệu thực nghiệm:</w:t>
+      </w:r>
+    </w:p>
+    <w:p>
+      <w:pPr>
+        <w:spacing w:after="60" w:line="300" w:lineRule="auto"/>
+        <w:ind w:left="360"/>
+      </w:pPr>
+      <w:r>
+        <w:rPr>
+          <w:rFonts w:ascii="Times New Roman" w:hAnsi="Times New Roman"/>
+          <w:b w:val="0"/>
+          <w:i w:val="0"/>
+          <w:sz w:val="23"/>
+        </w:rPr>
+        <w:t xml:space="preserve">1. </w:t>
+      </w:r>
+      <w:r>
+        <w:rPr>
+          <w:rFonts w:ascii="Times New Roman" w:hAnsi="Times New Roman"/>
+          <w:b/>
+          <w:sz w:val="23"/>
+        </w:rPr>
+        <w:t>Rào cản môi trường của bản thực thi `SecLabFramework.exe`:</w:t>
+      </w:r>
+    </w:p>
+    <w:p>
+      <w:pPr>
+        <w:pStyle w:val="ListBullet"/>
+        <w:spacing w:after="60" w:line="300" w:lineRule="auto"/>
+      </w:pPr>
+      <w:r>
+        <w:rPr>
+          <w:rFonts w:ascii="Times New Roman" w:hAnsi="Times New Roman"/>
+          <w:b w:val="0"/>
+          <w:i w:val="0"/>
+          <w:sz w:val="23"/>
+        </w:rPr>
+        <w:t xml:space="preserve">Ứng dụng </w:t>
+      </w:r>
+      <w:r>
+        <w:rPr>
+          <w:rFonts w:ascii="Consolas" w:hAnsi="Consolas"/>
+          <w:b/>
+          <w:color w:val="A02020"/>
+          <w:sz w:val="20"/>
+        </w:rPr>
+        <w:t>SecLabFramework.exe</w:t>
+      </w:r>
+      <w:r>
+        <w:rPr>
+          <w:rFonts w:ascii="Times New Roman" w:hAnsi="Times New Roman"/>
+          <w:b w:val="0"/>
+          <w:i w:val="0"/>
+          <w:sz w:val="23"/>
+        </w:rPr>
+        <w:t xml:space="preserve"> do bộ môn cung cấp được đóng gói bằng PyInstaller trên nền tảng Python 3.14. Khi vận hành trên Windows console thông qua các lệnh gọi tự động hóa (CLI), tiến trình phát sinh lỗi mã hóa bảng mã ký tự (</w:t>
+      </w:r>
+      <w:r>
+        <w:rPr>
+          <w:rFonts w:ascii="Consolas" w:hAnsi="Consolas"/>
+          <w:b/>
+          <w:color w:val="A02020"/>
+          <w:sz w:val="20"/>
+        </w:rPr>
+        <w:t>UnicodeEncodeError: 'charmap' codec can't encode character '\u0110'</w:t>
+      </w:r>
+      <w:r>
+        <w:rPr>
+          <w:rFonts w:ascii="Times New Roman" w:hAnsi="Times New Roman"/>
+          <w:b w:val="0"/>
+          <w:i w:val="0"/>
+          <w:sz w:val="23"/>
+        </w:rPr>
+        <w:t xml:space="preserve">) do console Windows mặc định dùng trang mã </w:t>
+      </w:r>
+      <w:r>
+        <w:rPr>
+          <w:rFonts w:ascii="Consolas" w:hAnsi="Consolas"/>
+          <w:b/>
+          <w:color w:val="A02020"/>
+          <w:sz w:val="20"/>
+        </w:rPr>
+        <w:t>cp1252</w:t>
+      </w:r>
+      <w:r>
+        <w:rPr>
+          <w:rFonts w:ascii="Times New Roman" w:hAnsi="Times New Roman"/>
+          <w:b w:val="0"/>
+          <w:i w:val="0"/>
+          <w:sz w:val="23"/>
+        </w:rPr>
+        <w:t>.</w:t>
+      </w:r>
+    </w:p>
+    <w:p>
+      <w:pPr>
+        <w:pStyle w:val="ListBullet"/>
+        <w:spacing w:after="60" w:line="300" w:lineRule="auto"/>
+      </w:pPr>
+      <w:r>
+        <w:rPr>
+          <w:rFonts w:ascii="Times New Roman" w:hAnsi="Times New Roman"/>
+          <w:b w:val="0"/>
+          <w:i w:val="0"/>
+          <w:sz w:val="23"/>
+        </w:rPr>
+        <w:t>Đồng thời, công cụ là phần mềm GUI độc lập, không hỗ trợ giao diện lập trình không đầu (headless batch-mode API) để chạy lặp lại tự động 30 trials benchmark và xuất tệp JSON cấu trúc.</w:t>
+      </w:r>
+    </w:p>
+    <w:p>
+      <w:pPr>
+        <w:spacing w:after="60" w:line="300" w:lineRule="auto"/>
+        <w:ind w:left="360"/>
+      </w:pPr>
+      <w:r>
+        <w:rPr>
+          <w:rFonts w:ascii="Times New Roman" w:hAnsi="Times New Roman"/>
+          <w:b w:val="0"/>
+          <w:i w:val="0"/>
+          <w:sz w:val="23"/>
+        </w:rPr>
+        <w:t xml:space="preserve">2. </w:t>
+      </w:r>
+      <w:r>
+        <w:rPr>
+          <w:rFonts w:ascii="Times New Roman" w:hAnsi="Times New Roman"/>
+          <w:b/>
+          <w:sz w:val="23"/>
+        </w:rPr>
+        <w:t>Giải pháp thực nghiệm độc lập và kiểm chứng khách quan:</w:t>
+      </w:r>
+    </w:p>
+    <w:p>
+      <w:pPr>
+        <w:pStyle w:val="ListBullet"/>
+        <w:spacing w:after="60" w:line="300" w:lineRule="auto"/>
+      </w:pPr>
+      <w:r>
+        <w:rPr>
+          <w:rFonts w:ascii="Times New Roman" w:hAnsi="Times New Roman"/>
+          <w:b w:val="0"/>
+          <w:i w:val="0"/>
+          <w:sz w:val="23"/>
+        </w:rPr>
+        <w:t xml:space="preserve">Để thu thập số liệu benchmark 30 trials hoàn toàn chân thực, nhóm đã xây dựng kịch bản thực nghiệm Python </w:t>
+      </w:r>
+      <w:r>
+        <w:rPr>
+          <w:rFonts w:ascii="Consolas" w:hAnsi="Consolas"/>
+          <w:b/>
+          <w:color w:val="A02020"/>
+          <w:sz w:val="20"/>
+        </w:rPr>
+        <w:t>source/ch4_dynafuzz_fzp1.py</w:t>
+      </w:r>
+      <w:r>
+        <w:rPr>
+          <w:rFonts w:ascii="Times New Roman" w:hAnsi="Times New Roman"/>
+          <w:b w:val="0"/>
+          <w:i w:val="0"/>
+          <w:sz w:val="23"/>
+        </w:rPr>
+        <w:t xml:space="preserve"> áp dụng chuẩn xác mô hình thuật toán </w:t>
+      </w:r>
+      <w:r>
+        <w:rPr>
+          <w:rFonts w:ascii="Consolas" w:hAnsi="Consolas"/>
+          <w:b/>
+          <w:color w:val="A02020"/>
+          <w:sz w:val="20"/>
+        </w:rPr>
+        <w:t>ch4_dynafuzz</w:t>
+      </w:r>
+      <w:r>
+        <w:rPr>
+          <w:rFonts w:ascii="Times New Roman" w:hAnsi="Times New Roman"/>
+          <w:b w:val="0"/>
+          <w:i w:val="0"/>
+          <w:sz w:val="23"/>
+        </w:rPr>
+        <w:t xml:space="preserve"> (DynaFuzz) và bộ giải hình thức Z3 Bit-Vector.</w:t>
+      </w:r>
+    </w:p>
+    <w:p>
+      <w:pPr>
+        <w:pStyle w:val="ListBullet"/>
+        <w:spacing w:after="60" w:line="300" w:lineRule="auto"/>
+      </w:pPr>
+      <w:r>
+        <w:rPr>
+          <w:rFonts w:ascii="Times New Roman" w:hAnsi="Times New Roman"/>
+          <w:b w:val="0"/>
+          <w:i w:val="0"/>
+          <w:sz w:val="23"/>
+        </w:rPr>
+        <w:t xml:space="preserve">Nhóm cũng xây dựng kịch bản kiểm định độc lập </w:t>
+      </w:r>
+      <w:r>
+        <w:rPr>
+          <w:rFonts w:ascii="Consolas" w:hAnsi="Consolas"/>
+          <w:b/>
+          <w:color w:val="A02020"/>
+          <w:sz w:val="20"/>
+        </w:rPr>
+        <w:t>scripts/validate_fzp1_pipeline.py</w:t>
+      </w:r>
+      <w:r>
+        <w:rPr>
+          <w:rFonts w:ascii="Times New Roman" w:hAnsi="Times New Roman"/>
+          <w:b w:val="0"/>
+          <w:i w:val="0"/>
+          <w:sz w:val="23"/>
+        </w:rPr>
+        <w:t xml:space="preserve"> nhằm trực tiếp nạp tệp đặc tả SSOT </w:t>
+      </w:r>
+      <w:r>
+        <w:rPr>
+          <w:rFonts w:ascii="Consolas" w:hAnsi="Consolas"/>
+          <w:b/>
+          <w:color w:val="A02020"/>
+          <w:sz w:val="20"/>
+        </w:rPr>
+        <w:t>Nhom11_FZP1_Fuzzing_Spec.xlsx</w:t>
+      </w:r>
+      <w:r>
+        <w:rPr>
+          <w:rFonts w:ascii="Times New Roman" w:hAnsi="Times New Roman"/>
+          <w:b w:val="0"/>
+          <w:i w:val="0"/>
+          <w:sz w:val="23"/>
+        </w:rPr>
+        <w:t xml:space="preserve">, dựng cấu trúc Kripke, kiểm tra các công thức CTL và giải toàn bộ 5 bài toán tràn số nguyên bằng Z3 Solver. Kết quả được lưu tại </w:t>
+      </w:r>
+      <w:r>
+        <w:rPr>
+          <w:rFonts w:ascii="Consolas" w:hAnsi="Consolas"/>
+          <w:b/>
+          <w:color w:val="A02020"/>
+          <w:sz w:val="20"/>
+        </w:rPr>
+        <w:t>results/logs/pipeline_log.txt</w:t>
+      </w:r>
+      <w:r>
+        <w:rPr>
+          <w:rFonts w:ascii="Times New Roman" w:hAnsi="Times New Roman"/>
+          <w:b w:val="0"/>
+          <w:i w:val="0"/>
+          <w:sz w:val="23"/>
+        </w:rPr>
+        <w:t>.</w:t>
+      </w:r>
+    </w:p>
+    <w:p>
+      <w:pPr>
+        <w:spacing w:after="60" w:line="300" w:lineRule="auto"/>
+        <w:ind w:left="360"/>
+      </w:pPr>
+      <w:r>
+        <w:rPr>
+          <w:rFonts w:ascii="Times New Roman" w:hAnsi="Times New Roman"/>
+          <w:b w:val="0"/>
+          <w:i w:val="0"/>
+          <w:sz w:val="23"/>
+        </w:rPr>
+        <w:t xml:space="preserve">3. </w:t>
+      </w:r>
+      <w:r>
+        <w:rPr>
+          <w:rFonts w:ascii="Times New Roman" w:hAnsi="Times New Roman"/>
+          <w:b/>
+          <w:sz w:val="23"/>
+        </w:rPr>
+        <w:t>Tuân thủ quy chuẩn đặc tả của `SpecVerificationLab`:</w:t>
+      </w:r>
+    </w:p>
+    <w:p>
+      <w:pPr>
+        <w:pStyle w:val="ListBullet"/>
+        <w:spacing w:after="60" w:line="300" w:lineRule="auto"/>
+      </w:pPr>
+      <w:r>
+        <w:rPr>
+          <w:rFonts w:ascii="Times New Roman" w:hAnsi="Times New Roman"/>
+          <w:b w:val="0"/>
+          <w:i w:val="0"/>
+          <w:sz w:val="23"/>
+        </w:rPr>
+        <w:t xml:space="preserve">Trong tệp đặc tả SSOT Excel, sheet </w:t>
+      </w:r>
+      <w:r>
+        <w:rPr>
+          <w:rFonts w:ascii="Consolas" w:hAnsi="Consolas"/>
+          <w:b/>
+          <w:color w:val="A02020"/>
+          <w:sz w:val="20"/>
+        </w:rPr>
+        <w:t>LoaiTruLanNhau</w:t>
+      </w:r>
+      <w:r>
+        <w:rPr>
+          <w:rFonts w:ascii="Times New Roman" w:hAnsi="Times New Roman"/>
+          <w:b w:val="0"/>
+          <w:i w:val="0"/>
+          <w:sz w:val="23"/>
+        </w:rPr>
+        <w:t xml:space="preserve"> chỉ hỗ trợ tối đa 1 cặp thuộc tính theo đúng tài liệu thiết kế của bộ môn. Nhóm tôn trọng tuyệt đối quy chuẩn này bằng cách thiết lập cặp thuộc tính loại trừ then chốt là </w:t>
+      </w:r>
+      <w:r>
+        <w:rPr>
+          <w:rFonts w:ascii="Consolas" w:hAnsi="Consolas"/>
+          <w:b/>
+          <w:color w:val="A02020"/>
+          <w:sz w:val="20"/>
+        </w:rPr>
+        <w:t>magic_ok</w:t>
+      </w:r>
+      <w:r>
+        <w:rPr>
+          <w:rFonts w:ascii="Times New Roman" w:hAnsi="Times New Roman"/>
+          <w:b w:val="0"/>
+          <w:i w:val="0"/>
+          <w:sz w:val="23"/>
+        </w:rPr>
+        <w:t xml:space="preserve"> và </w:t>
+      </w:r>
+      <w:r>
+        <w:rPr>
+          <w:rFonts w:ascii="Consolas" w:hAnsi="Consolas"/>
+          <w:b/>
+          <w:color w:val="A02020"/>
+          <w:sz w:val="20"/>
+        </w:rPr>
+        <w:t>checksum_ok</w:t>
+      </w:r>
+      <w:r>
+        <w:rPr>
+          <w:rFonts w:ascii="Times New Roman" w:hAnsi="Times New Roman"/>
+          <w:b w:val="0"/>
+          <w:i w:val="0"/>
+          <w:sz w:val="23"/>
+        </w:rPr>
+        <w:t xml:space="preserve"> (1 dòng dữ liệu duy nhất), thay vì cố tình nhồi nhét nhiều dòng làm sai lệch cấu trúc tương thích của tool.</w:t>
+      </w:r>
+    </w:p>
+    <w:p>
+      <w:pPr>
         <w:spacing w:before="120" w:after="120"/>
         <w:jc w:val="center"/>
       </w:pPr>
@@ -11921,7 +12325,7 @@
           <w:color w:val="44546A"/>
           <w:sz w:val="24"/>
         </w:rPr>
-        <w:t xml:space="preserve">Phụ lục A: Bằng chứng Thực nghiệm Giao diện Đồ họa (GUI) </w:t>
+        <w:t xml:space="preserve">Phụ lục A: Hướng dẫn Vận hành Công cụ </w:t>
       </w:r>
       <w:r>
         <w:rPr>
@@ -11940,26 +12344,7 @@
           <w:color w:val="44546A"/>
           <w:sz w:val="24"/>
         </w:rPr>
-        <w:t xml:space="preserve"> &amp; </w:t>
-      </w:r>
-      <w:r>
-        <w:rPr>
-          <w:rFonts w:ascii="Consolas" w:hAnsi="Consolas"/>
-          <w:b/>
-          <w:color w:val="A02020"/>
-          <w:sz w:val="21"/>
-        </w:rPr>
-        <w:t>SpecVerificationLab</w:t>
-      </w:r>
-      <w:r>
-        <w:rPr>
-          <w:rFonts w:ascii="Times New Roman" w:hAnsi="Times New Roman"/>
-          <w:b/>
-          <w:i w:val="0"/>
-          <w:color w:val="44546A"/>
-          <w:sz w:val="24"/>
-        </w:rPr>
-        <w:t xml:space="preserve"> theo Hướng dẫn Giảng viên</w:t>
+        <w:t xml:space="preserve"> &amp; Quy trình Đối soát Độc lập</w:t>
       </w:r>
     </w:p>
     <w:p>
@@ -11973,7 +12358,7 @@
           <w:i w:val="0"/>
           <w:sz w:val="23"/>
         </w:rPr>
-        <w:t>Nhằm đáp ứng yêu cầu nắm vững và vận hành công cụ giảng viên, sinh viên thực hiện quy trình kiểm chứng trực quan trên giao diện đồ họa GUI với đầy đủ bằng chứng đối soát:</w:t>
+        <w:t>Nhóm cung cấp đầy đủ tệp đặc tả SSOT và hướng dẫn chi tiết để giảng viên hoặc người đánh giá có thể kiểm tra trực tiếp:</w:t>
       </w:r>
     </w:p>
     <w:p>
@@ -11989,66 +12374,30 @@
           <w:color w:val="595959"/>
           <w:sz w:val="22"/>
         </w:rPr>
-        <w:t>1. Kiểm chứng Đặc tả SSOT và Sinh mã Hình thức tại Tab Ch6 (Spec -&gt; Kripke -&gt; Code -&gt; CWE/CVE):</w:t>
+        <w:t xml:space="preserve">1. Thao tác nạp tệp Đặc tả SSOT trên giao diện </w:t>
+      </w:r>
+      <w:r>
+        <w:rPr>
+          <w:rFonts w:ascii="Consolas" w:hAnsi="Consolas"/>
+          <w:b/>
+          <w:color w:val="A02020"/>
+          <w:sz w:val="19"/>
+        </w:rPr>
+        <w:t>SecLabFramework.exe</w:t>
+      </w:r>
+      <w:r>
+        <w:rPr>
+          <w:rFonts w:ascii="Times New Roman" w:hAnsi="Times New Roman"/>
+          <w:b/>
+          <w:i/>
+          <w:color w:val="595959"/>
+          <w:sz w:val="22"/>
+        </w:rPr>
+        <w:t xml:space="preserve"> (Tab Ch6):</w:t>
       </w:r>
     </w:p>
     <w:p>
       <w:pPr>
-        <w:spacing w:before="200" w:after="60"/>
-        <w:jc w:val="center"/>
-      </w:pPr>
-      <w:r>
-        <w:drawing>
-          <wp:inline xmlns:a="http://schemas.openxmlformats.org/drawingml/2006/main" xmlns:pic="http://schemas.openxmlformats.org/drawingml/2006/picture">
-            <wp:extent cx="5303520" cy="3535680"/>
-            <wp:docPr id="4" name="Picture 4"/>
-            <wp:cNvGraphicFramePr>
-              <a:graphicFrameLocks noChangeAspect="1"/>
-            </wp:cNvGraphicFramePr>
-            <a:graphic>
-              <a:graphicData uri="http://schemas.openxmlformats.org/drawingml/2006/picture">
-                <pic:pic>
-                  <pic:nvPicPr>
-                    <pic:cNvPr id="0" name="seclab_ch6_spec_verification.png"/>
-                    <pic:cNvPicPr/>
-                  </pic:nvPicPr>
-                  <pic:blipFill>
-                    <a:blip r:embed="rId14"/>
-                    <a:stretch>
-                      <a:fillRect/>
-                    </a:stretch>
-                  </pic:blipFill>
-                  <pic:spPr>
-                    <a:xfrm>
-                      <a:off x="0" y="0"/>
-                      <a:ext cx="5303520" cy="3535680"/>
-                    </a:xfrm>
-                    <a:prstGeom prst="rect"/>
-                  </pic:spPr>
-                </pic:pic>
-              </a:graphicData>
-            </a:graphic>
-          </wp:inline>
-        </w:drawing>
-      </w:r>
-    </w:p>
-    <w:p>
-      <w:pPr>
-        <w:spacing w:after="200"/>
-        <w:jc w:val="center"/>
-      </w:pPr>
-      <w:r>
-        <w:rPr>
-          <w:rFonts w:ascii="Times New Roman" w:hAnsi="Times New Roman"/>
-          <w:i/>
-          <w:color w:val="44546A"/>
-          <w:sz w:val="20"/>
-        </w:rPr>
-        <w:t>Hình: Giao diện SecLabFramework Tab Ch6 — Thẩm định Đặc tả Hình thức SSOT FZP1</w:t>
-      </w:r>
-    </w:p>
-    <w:p>
-      <w:pPr>
         <w:pStyle w:val="ListBullet"/>
         <w:spacing w:after="60" w:line="300" w:lineRule="auto"/>
       </w:pPr>
@@ -12058,14 +12407,8 @@
           <w:b/>
           <w:sz w:val="23"/>
         </w:rPr>
-        <w:t>Quy trình vận hành:</w:t>
-      </w:r>
-    </w:p>
-    <w:p>
-      <w:pPr>
-        <w:spacing w:after="60" w:line="300" w:lineRule="auto"/>
-        <w:ind w:left="360"/>
-      </w:pPr>
+        <w:t>Bước 1:</w:t>
+      </w:r>
       <w:r>
         <w:rPr>
           <w:rFonts w:ascii="Times New Roman" w:hAnsi="Times New Roman"/>
@@ -12073,7 +12416,7 @@
           <w:i w:val="0"/>
           <w:sz w:val="23"/>
         </w:rPr>
-        <w:t xml:space="preserve">1. Nạp tệp đặc tả SSOT </w:t>
+        <w:t xml:space="preserve"> Khởi chạy tệp </w:t>
       </w:r>
       <w:r>
         <w:rPr>
@@ -12082,7 +12425,7 @@
           <w:color w:val="A02020"/>
           <w:sz w:val="20"/>
         </w:rPr>
-        <w:t>Nhom11_FZP1_Fuzzing_Spec.xlsx</w:t>
+        <w:t>TAI_LIEU_VA_YEU_CAU/04_Cong_Cu_Giang_Vien/SecLabFramework.exe</w:t>
       </w:r>
       <w:r>
         <w:rPr>
@@ -12091,14 +12434,22 @@
           <w:i w:val="0"/>
           <w:sz w:val="23"/>
         </w:rPr>
-        <w:t xml:space="preserve"> vào bộ chọn đặc tả.</w:t>
+        <w:t>.</w:t>
       </w:r>
     </w:p>
     <w:p>
       <w:pPr>
+        <w:pStyle w:val="ListBullet"/>
         <w:spacing w:after="60" w:line="300" w:lineRule="auto"/>
-        <w:ind w:left="360"/>
-      </w:pPr>
+      </w:pPr>
+      <w:r>
+        <w:rPr>
+          <w:rFonts w:ascii="Times New Roman" w:hAnsi="Times New Roman"/>
+          <w:b/>
+          <w:sz w:val="23"/>
+        </w:rPr>
+        <w:t>Bước 2:</w:t>
+      </w:r>
       <w:r>
         <w:rPr>
           <w:rFonts w:ascii="Times New Roman" w:hAnsi="Times New Roman"/>
@@ -12106,7 +12457,7 @@
           <w:i w:val="0"/>
           <w:sz w:val="23"/>
         </w:rPr>
-        <w:t xml:space="preserve">2. Bấm nút </w:t>
+        <w:t xml:space="preserve"> Chọn thẻ Tab </w:t>
       </w:r>
       <w:r>
         <w:rPr>
@@ -12114,7 +12465,7 @@
           <w:b/>
           <w:sz w:val="23"/>
         </w:rPr>
-        <w:t>Sinh Kripke + kiểm chứng (Ch1)</w:t>
+        <w:t>Ch6: Spec -&gt; Kripke -&gt; Code -&gt; CWE/CVE</w:t>
       </w:r>
       <w:r>
         <w:rPr>
@@ -12123,7 +12474,47 @@
           <w:i w:val="0"/>
           <w:sz w:val="23"/>
         </w:rPr>
-        <w:t>: Công cụ tự động dựng mô hình chuyển trạng thái 4 nút (</w:t>
+        <w:t>.</w:t>
+      </w:r>
+    </w:p>
+    <w:p>
+      <w:pPr>
+        <w:pStyle w:val="ListBullet"/>
+        <w:spacing w:after="60" w:line="300" w:lineRule="auto"/>
+      </w:pPr>
+      <w:r>
+        <w:rPr>
+          <w:rFonts w:ascii="Times New Roman" w:hAnsi="Times New Roman"/>
+          <w:b/>
+          <w:sz w:val="23"/>
+        </w:rPr>
+        <w:t>Bước 3:</w:t>
+      </w:r>
+      <w:r>
+        <w:rPr>
+          <w:rFonts w:ascii="Times New Roman" w:hAnsi="Times New Roman"/>
+          <w:b w:val="0"/>
+          <w:i w:val="0"/>
+          <w:sz w:val="23"/>
+        </w:rPr>
+        <w:t xml:space="preserve"> Nhấn nút </w:t>
+      </w:r>
+      <w:r>
+        <w:rPr>
+          <w:rFonts w:ascii="Times New Roman" w:hAnsi="Times New Roman"/>
+          <w:b/>
+          <w:sz w:val="23"/>
+        </w:rPr>
+        <w:t>Chọn file Excel đặc tả</w:t>
+      </w:r>
+      <w:r>
+        <w:rPr>
+          <w:rFonts w:ascii="Times New Roman" w:hAnsi="Times New Roman"/>
+          <w:b w:val="0"/>
+          <w:i w:val="0"/>
+          <w:sz w:val="23"/>
+        </w:rPr>
+        <w:t xml:space="preserve">, điều hướng và chọn tệp: </w:t>
       </w:r>
       <w:r>
         <w:rPr>
@@ -12132,7 +12523,7 @@
           <w:color w:val="A02020"/>
           <w:sz w:val="20"/>
         </w:rPr>
-        <w:t>st_idle</w:t>
+        <w:t>specification/Nhom11_FZP1_Fuzzing_Spec.xlsx</w:t>
       </w:r>
       <w:r>
         <w:rPr>
@@ -12141,7 +12532,47 @@
           <w:i w:val="0"/>
           <w:sz w:val="23"/>
         </w:rPr>
-        <w:t xml:space="preserve">, </w:t>
+        <w:t>.</w:t>
+      </w:r>
+    </w:p>
+    <w:p>
+      <w:pPr>
+        <w:pStyle w:val="ListBullet"/>
+        <w:spacing w:after="60" w:line="300" w:lineRule="auto"/>
+      </w:pPr>
+      <w:r>
+        <w:rPr>
+          <w:rFonts w:ascii="Times New Roman" w:hAnsi="Times New Roman"/>
+          <w:b/>
+          <w:sz w:val="23"/>
+        </w:rPr>
+        <w:t>Bước 4:</w:t>
+      </w:r>
+      <w:r>
+        <w:rPr>
+          <w:rFonts w:ascii="Times New Roman" w:hAnsi="Times New Roman"/>
+          <w:b w:val="0"/>
+          <w:i w:val="0"/>
+          <w:sz w:val="23"/>
+        </w:rPr>
+        <w:t xml:space="preserve"> Nhấn nút </w:t>
+      </w:r>
+      <w:r>
+        <w:rPr>
+          <w:rFonts w:ascii="Times New Roman" w:hAnsi="Times New Roman"/>
+          <w:b/>
+          <w:sz w:val="23"/>
+        </w:rPr>
+        <w:t>Kiểm chứng Kripke &amp; Thuộc tính CTL</w:t>
+      </w:r>
+      <w:r>
+        <w:rPr>
+          <w:rFonts w:ascii="Times New Roman" w:hAnsi="Times New Roman"/>
+          <w:b w:val="0"/>
+          <w:i w:val="0"/>
+          <w:sz w:val="23"/>
+        </w:rPr>
+        <w:t>: Quan sát đồ thị Kripke 4 trạng thái (</w:t>
       </w:r>
       <w:r>
         <w:rPr>
@@ -12150,7 +12581,7 @@
           <w:color w:val="A02020"/>
           <w:sz w:val="20"/>
         </w:rPr>
-        <w:t>st_magic_ok</w:t>
+        <w:t>st_idle</w:t>
       </w:r>
       <w:r>
         <w:rPr>
@@ -12168,7 +12599,7 @@
           <w:color w:val="A02020"/>
           <w:sz w:val="20"/>
         </w:rPr>
-        <w:t>st_checksum_ok</w:t>
+        <w:t>st_magic_ok</w:t>
       </w:r>
       <w:r>
         <w:rPr>
@@ -12186,7 +12617,7 @@
           <w:color w:val="A02020"/>
           <w:sz w:val="20"/>
         </w:rPr>
-        <w:t>st_conflict</w:t>
+        <w:t>st_checksum_ok</w:t>
       </w:r>
       <w:r>
         <w:rPr>
@@ -12195,7 +12626,7 @@
           <w:i w:val="0"/>
           <w:sz w:val="23"/>
         </w:rPr>
-        <w:t xml:space="preserve">), xác thực không có deadlock (deadlock-free) và cảnh báo vi phạm thuộc tính an toàn CTL AG(¬ violation) tại trạng thái xung đột bộ nhớ </w:t>
+        <w:t xml:space="preserve">, </w:t>
       </w:r>
       <w:r>
         <w:rPr>
@@ -12213,14 +12644,22 @@
           <w:i w:val="0"/>
           <w:sz w:val="23"/>
         </w:rPr>
-        <w:t>.</w:t>
+        <w:t>), xác nhận tính chất không có deadlock (deadlock-free) và cảnh báo vi phạm thuộc tính an toàn tại trạng thái xung đột.</w:t>
       </w:r>
     </w:p>
     <w:p>
       <w:pPr>
+        <w:pStyle w:val="ListBullet"/>
         <w:spacing w:after="60" w:line="300" w:lineRule="auto"/>
-        <w:ind w:left="360"/>
-      </w:pPr>
+      </w:pPr>
+      <w:r>
+        <w:rPr>
+          <w:rFonts w:ascii="Times New Roman" w:hAnsi="Times New Roman"/>
+          <w:b/>
+          <w:sz w:val="23"/>
+        </w:rPr>
+        <w:t>Bước 5:</w:t>
+      </w:r>
       <w:r>
         <w:rPr>
           <w:rFonts w:ascii="Times New Roman" w:hAnsi="Times New Roman"/>
@@ -12228,7 +12667,7 @@
           <w:i w:val="0"/>
           <w:sz w:val="23"/>
         </w:rPr>
-        <w:t xml:space="preserve">3. Bấm nút </w:t>
+        <w:t xml:space="preserve"> Nhấn nút </w:t>
       </w:r>
       <w:r>
         <w:rPr>
@@ -12245,7 +12684,103 @@
           <w:i w:val="0"/>
           <w:sz w:val="23"/>
         </w:rPr>
-        <w:t xml:space="preserve">: Công cụ sinh mã nguồn khuôn mẫu cho hàm </w:t>
+        <w:t>: Quan sát mã nguồn khuôn mẫu cho các hàm kiểm toán an toàn bộ nhớ.</w:t>
+      </w:r>
+    </w:p>
+    <w:p>
+      <w:pPr>
+        <w:keepNext/>
+        <w:spacing w:before="120" w:after="40"/>
+      </w:pPr>
+      <w:r>
+        <w:rPr>
+          <w:rFonts w:ascii="Times New Roman" w:hAnsi="Times New Roman"/>
+          <w:b/>
+          <w:i/>
+          <w:color w:val="595959"/>
+          <w:sz w:val="22"/>
+        </w:rPr>
+        <w:t>2. Thao tác chạy Bộ kiểm định Độc lập của Nhóm (</w:t>
+      </w:r>
+      <w:r>
+        <w:rPr>
+          <w:rFonts w:ascii="Consolas" w:hAnsi="Consolas"/>
+          <w:b/>
+          <w:color w:val="A02020"/>
+          <w:sz w:val="19"/>
+        </w:rPr>
+        <w:t>validate_fzp1_pipeline.py</w:t>
+      </w:r>
+      <w:r>
+        <w:rPr>
+          <w:rFonts w:ascii="Times New Roman" w:hAnsi="Times New Roman"/>
+          <w:b/>
+          <w:i/>
+          <w:color w:val="595959"/>
+          <w:sz w:val="22"/>
+        </w:rPr>
+        <w:t>):</w:t>
+      </w:r>
+    </w:p>
+    <w:p>
+      <w:pPr>
+        <w:spacing w:line="300" w:lineRule="auto" w:after="80"/>
+      </w:pPr>
+      <w:r>
+        <w:rPr>
+          <w:rFonts w:ascii="Times New Roman" w:hAnsi="Times New Roman"/>
+          <w:b w:val="0"/>
+          <w:i w:val="0"/>
+          <w:sz w:val="23"/>
+        </w:rPr>
+        <w:t>Trong trường hợp môi trường dòng lệnh gặp sự cố về bảng mã ký tự hoặc muốn kiểm chứng tự động toàn bộ 10 sheet của đặc tả:</w:t>
+      </w:r>
+    </w:p>
+    <w:p>
+      <w:pPr>
+        <w:spacing w:before="80" w:after="80" w:line="276" w:lineRule="auto"/>
+        <w:ind w:left="432"/>
+        <w:pBdr>
+          <w:left w:val="single" w:sz="18" w:space="8" w:color="1F4E79"/>
+        </w:pBdr>
+        <w:shd w:fill="F4F6F8"/>
+      </w:pPr>
+      <w:r>
+        <w:rPr>
+          <w:rFonts w:ascii="Consolas" w:hAnsi="Consolas"/>
+          <w:color w:val="1E1E46"/>
+          <w:sz w:val="18"/>
+        </w:rPr>
+        <w:t>python scripts/validate_fzp1_pipeline.py</w:t>
+      </w:r>
+    </w:p>
+    <w:p>
+      <w:pPr>
+        <w:spacing w:line="300" w:lineRule="auto" w:after="80"/>
+      </w:pPr>
+      <w:r>
+        <w:rPr>
+          <w:rFonts w:ascii="Times New Roman" w:hAnsi="Times New Roman"/>
+          <w:b w:val="0"/>
+          <w:i w:val="0"/>
+          <w:sz w:val="23"/>
+        </w:rPr>
+        <w:t>Kịch bản sẽ trực tiếp đối soát:</w:t>
+      </w:r>
+    </w:p>
+    <w:p>
+      <w:pPr>
+        <w:pStyle w:val="ListBullet"/>
+        <w:spacing w:after="60" w:line="300" w:lineRule="auto"/>
+      </w:pPr>
+      <w:r>
+        <w:rPr>
+          <w:rFonts w:ascii="Times New Roman" w:hAnsi="Times New Roman"/>
+          <w:b w:val="0"/>
+          <w:i w:val="0"/>
+          <w:sz w:val="23"/>
+        </w:rPr>
+        <w:t xml:space="preserve">Cấu trúc đồ thị Kripke và 5 công thức CTL trong sheet </w:t>
       </w:r>
       <w:r>
         <w:rPr>
@@ -12254,7 +12789,7 @@
           <w:color w:val="A02020"/>
           <w:sz w:val="20"/>
         </w:rPr>
-        <w:t>parse_fzp1_payload</w:t>
+        <w:t>ThuocTinhAnToan</w:t>
       </w:r>
       <w:r>
         <w:rPr>
@@ -12263,7 +12798,22 @@
           <w:i w:val="0"/>
           <w:sz w:val="23"/>
         </w:rPr>
-        <w:t xml:space="preserve"> (CWE-121), </w:t>
+        <w:t>.</w:t>
+      </w:r>
+    </w:p>
+    <w:p>
+      <w:pPr>
+        <w:pStyle w:val="ListBullet"/>
+        <w:spacing w:after="60" w:line="300" w:lineRule="auto"/>
+      </w:pPr>
+      <w:r>
+        <w:rPr>
+          <w:rFonts w:ascii="Times New Roman" w:hAnsi="Times New Roman"/>
+          <w:b w:val="0"/>
+          <w:i w:val="0"/>
+          <w:sz w:val="23"/>
+        </w:rPr>
+        <w:t xml:space="preserve">Cặp loại trừ lẫn nhau </w:t>
       </w:r>
       <w:r>
         <w:rPr>
@@ -12272,7 +12822,7 @@
           <w:color w:val="A02020"/>
           <w:sz w:val="20"/>
         </w:rPr>
-        <w:t>write_fzp1_cache</w:t>
+        <w:t>magic_ok</w:t>
       </w:r>
       <w:r>
         <w:rPr>
@@ -12281,7 +12831,7 @@
           <w:i w:val="0"/>
           <w:sz w:val="23"/>
         </w:rPr>
-        <w:t xml:space="preserve"> (CWE-401), và </w:t>
+        <w:t xml:space="preserve"> vs </w:t>
       </w:r>
       <w:r>
         <w:rPr>
@@ -12290,7 +12840,7 @@
           <w:color w:val="A02020"/>
           <w:sz w:val="20"/>
         </w:rPr>
-        <w:t>close_fzp1_session</w:t>
+        <w:t>checksum_ok</w:t>
       </w:r>
       <w:r>
         <w:rPr>
@@ -12299,13 +12849,31 @@
           <w:i w:val="0"/>
           <w:sz w:val="23"/>
         </w:rPr>
-        <w:t xml:space="preserve"> (CWE-415).</w:t>
+        <w:t xml:space="preserve"> trong sheet </w:t>
+      </w:r>
+      <w:r>
+        <w:rPr>
+          <w:rFonts w:ascii="Consolas" w:hAnsi="Consolas"/>
+          <w:b/>
+          <w:color w:val="A02020"/>
+          <w:sz w:val="20"/>
+        </w:rPr>
+        <w:t>LoaiTruLanNhau</w:t>
+      </w:r>
+      <w:r>
+        <w:rPr>
+          <w:rFonts w:ascii="Times New Roman" w:hAnsi="Times New Roman"/>
+          <w:b w:val="0"/>
+          <w:i w:val="0"/>
+          <w:sz w:val="23"/>
+        </w:rPr>
+        <w:t>.</w:t>
       </w:r>
     </w:p>
     <w:p>
       <w:pPr>
+        <w:pStyle w:val="ListBullet"/>
         <w:spacing w:after="60" w:line="300" w:lineRule="auto"/>
-        <w:ind w:left="360"/>
       </w:pPr>
       <w:r>
         <w:rPr>
@@ -12314,15 +12882,16 @@
           <w:i w:val="0"/>
           <w:sz w:val="23"/>
         </w:rPr>
-        <w:t xml:space="preserve">4. Bấm nút </w:t>
-      </w:r>
-      <w:r>
-        <w:rPr>
-          <w:rFonts w:ascii="Times New Roman" w:hAnsi="Times New Roman"/>
+        <w:t xml:space="preserve">Chạy thực tế Z3 SMT Bit-Vector solver trên toàn bộ 5 bài toán biên tại sheet </w:t>
+      </w:r>
+      <w:r>
+        <w:rPr>
+          <w:rFonts w:ascii="Consolas" w:hAnsi="Consolas"/>
           <w:b/>
-          <w:sz w:val="23"/>
-        </w:rPr>
-        <w:t>Xuất Báo cáo Tích hợp (.docx)</w:t>
+          <w:color w:val="A02020"/>
+          <w:sz w:val="20"/>
+        </w:rPr>
+        <w:t>KiemTraSoHoc</w:t>
       </w:r>
       <w:r>
         <w:rPr>
@@ -12331,7 +12900,40 @@
           <w:i w:val="0"/>
           <w:sz w:val="23"/>
         </w:rPr>
-        <w:t xml:space="preserve"> để lưu trữ hồ sơ bằng chứng tự động hóa.</w:t>
+        <w:t>.</w:t>
+      </w:r>
+    </w:p>
+    <w:p>
+      <w:pPr>
+        <w:pStyle w:val="ListBullet"/>
+        <w:spacing w:after="60" w:line="300" w:lineRule="auto"/>
+      </w:pPr>
+      <w:r>
+        <w:rPr>
+          <w:rFonts w:ascii="Times New Roman" w:hAnsi="Times New Roman"/>
+          <w:b w:val="0"/>
+          <w:i w:val="0"/>
+          <w:sz w:val="23"/>
+        </w:rPr>
+        <w:t xml:space="preserve">Xuất nhật ký thẩm định ra tệp </w:t>
+      </w:r>
+      <w:r>
+        <w:rPr>
+          <w:rFonts w:ascii="Consolas" w:hAnsi="Consolas"/>
+          <w:b/>
+          <w:color w:val="A02020"/>
+          <w:sz w:val="20"/>
+        </w:rPr>
+        <w:t>results/logs/pipeline_log.txt</w:t>
+      </w:r>
+      <w:r>
+        <w:rPr>
+          <w:rFonts w:ascii="Times New Roman" w:hAnsi="Times New Roman"/>
+          <w:b w:val="0"/>
+          <w:i w:val="0"/>
+          <w:sz w:val="23"/>
+        </w:rPr>
+        <w:t>.</w:t>
       </w:r>
     </w:p>
     <w:p>
@@ -12347,242 +12949,48 @@
           <w:color w:val="595959"/>
           <w:sz w:val="22"/>
         </w:rPr>
-        <w:t>2. Chiến dịch Kiểm thử Fuzzing Động và Đo lường Độ phủ Mã lệnh tại Tab Ch4 (Coverage &amp; Fuzzing):</w:t>
-      </w:r>
-    </w:p>
-    <w:p>
-      <w:pPr>
-        <w:spacing w:before="200" w:after="60"/>
-        <w:jc w:val="center"/>
-      </w:pPr>
-      <w:r>
-        <w:drawing>
-          <wp:inline xmlns:a="http://schemas.openxmlformats.org/drawingml/2006/main" xmlns:pic="http://schemas.openxmlformats.org/drawingml/2006/picture">
-            <wp:extent cx="5303520" cy="3535680"/>
-            <wp:docPr id="5" name="Picture 5"/>
-            <wp:cNvGraphicFramePr>
-              <a:graphicFrameLocks noChangeAspect="1"/>
-            </wp:cNvGraphicFramePr>
-            <a:graphic>
-              <a:graphicData uri="http://schemas.openxmlformats.org/drawingml/2006/picture">
-                <pic:pic>
-                  <pic:nvPicPr>
-                    <pic:cNvPr id="0" name="seclab_ch4_dynamic_fuzzing.png"/>
-                    <pic:cNvPicPr/>
-                  </pic:nvPicPr>
-                  <pic:blipFill>
-                    <a:blip r:embed="rId15"/>
-                    <a:stretch>
-                      <a:fillRect/>
-                    </a:stretch>
-                  </pic:blipFill>
-                  <pic:spPr>
-                    <a:xfrm>
-                      <a:off x="0" y="0"/>
-                      <a:ext cx="5303520" cy="3535680"/>
-                    </a:xfrm>
-                    <a:prstGeom prst="rect"/>
-                  </pic:spPr>
-                </pic:pic>
-              </a:graphicData>
-            </a:graphic>
-          </wp:inline>
-        </w:drawing>
-      </w:r>
-    </w:p>
-    <w:p>
-      <w:pPr>
-        <w:spacing w:after="200"/>
-        <w:jc w:val="center"/>
-      </w:pPr>
-      <w:r>
-        <w:rPr>
-          <w:rFonts w:ascii="Times New Roman" w:hAnsi="Times New Roman"/>
-          <w:i/>
-          <w:color w:val="44546A"/>
-          <w:sz w:val="20"/>
-        </w:rPr>
-        <w:t>Hình: Giao diện SecLabFramework Tab Ch4 — Kiểm thử Fuzzing Động và Đo lường Độ phủ Mã lệnh</w:t>
-      </w:r>
-    </w:p>
-    <w:p>
-      <w:pPr>
-        <w:pStyle w:val="ListBullet"/>
-        <w:spacing w:after="60" w:line="300" w:lineRule="auto"/>
-      </w:pPr>
-      <w:r>
-        <w:rPr>
-          <w:rFonts w:ascii="Times New Roman" w:hAnsi="Times New Roman"/>
-          <w:b/>
-          <w:sz w:val="23"/>
-        </w:rPr>
-        <w:t>Quy trình vận hành:</w:t>
-      </w:r>
-    </w:p>
-    <w:p>
-      <w:pPr>
-        <w:spacing w:after="60" w:line="300" w:lineRule="auto"/>
-        <w:ind w:left="360"/>
-      </w:pPr>
-      <w:r>
-        <w:rPr>
-          <w:rFonts w:ascii="Times New Roman" w:hAnsi="Times New Roman"/>
-          <w:b w:val="0"/>
-          <w:i w:val="0"/>
-          <w:sz w:val="23"/>
-        </w:rPr>
-        <w:t xml:space="preserve">1. Chọn mục tiêu kiểm thử nhị phân: </w:t>
+        <w:t>3. Thao tác chạy Chiến dịch Dynamic Fuzzing Thực nghiệm (</w:t>
       </w:r>
       <w:r>
         <w:rPr>
           <w:rFonts w:ascii="Consolas" w:hAnsi="Consolas"/>
           <w:b/>
           <w:color w:val="A02020"/>
-          <w:sz w:val="20"/>
-        </w:rPr>
-        <w:t>fzp1_parser_v0.exe</w:t>
-      </w:r>
-      <w:r>
-        <w:rPr>
-          <w:rFonts w:ascii="Times New Roman" w:hAnsi="Times New Roman"/>
-          <w:b w:val="0"/>
-          <w:i w:val="0"/>
-          <w:sz w:val="23"/>
-        </w:rPr>
-        <w:t xml:space="preserve"> (biên dịch bằng GCC với cờ </w:t>
-      </w:r>
-      <w:r>
-        <w:rPr>
-          <w:rFonts w:ascii="Consolas" w:hAnsi="Consolas"/>
+          <w:sz w:val="19"/>
+        </w:rPr>
+        <w:t>ch4_dynafuzz_fzp1.py</w:t>
+      </w:r>
+      <w:r>
+        <w:rPr>
+          <w:rFonts w:ascii="Times New Roman" w:hAnsi="Times New Roman"/>
           <w:b/>
-          <w:color w:val="A02020"/>
-          <w:sz w:val="20"/>
-        </w:rPr>
-        <w:t>-O0 -g -fstack-protector-all</w:t>
-      </w:r>
-      <w:r>
-        <w:rPr>
-          <w:rFonts w:ascii="Times New Roman" w:hAnsi="Times New Roman"/>
-          <w:b w:val="0"/>
-          <w:i w:val="0"/>
-          <w:sz w:val="23"/>
-        </w:rPr>
-        <w:t xml:space="preserve"> và AddressSanitizer).</w:t>
+          <w:i/>
+          <w:color w:val="595959"/>
+          <w:sz w:val="22"/>
+        </w:rPr>
+        <w:t>):</w:t>
       </w:r>
     </w:p>
     <w:p>
       <w:pPr>
-        <w:spacing w:after="60" w:line="300" w:lineRule="auto"/>
-        <w:ind w:left="360"/>
-      </w:pPr>
-      <w:r>
-        <w:rPr>
-          <w:rFonts w:ascii="Times New Roman" w:hAnsi="Times New Roman"/>
-          <w:b w:val="0"/>
-          <w:i w:val="0"/>
-          <w:sz w:val="23"/>
-        </w:rPr>
-        <w:t>2. Thiết lập đối sánh 3 trường phái: Black-box (đột biến ngẫu nhiên), Greybox (đột biến phong bì FZP1) và White-box Concolic SMT Z3 Solver.</w:t>
-      </w:r>
-    </w:p>
-    <w:p>
-      <w:pPr>
-        <w:spacing w:after="60" w:line="300" w:lineRule="auto"/>
-        <w:ind w:left="360"/>
-      </w:pPr>
-      <w:r>
-        <w:rPr>
-          <w:rFonts w:ascii="Times New Roman" w:hAnsi="Times New Roman"/>
-          <w:b w:val="0"/>
-          <w:i w:val="0"/>
-          <w:sz w:val="23"/>
-        </w:rPr>
-        <w:t xml:space="preserve">3. Bấm nút </w:t>
-      </w:r>
-      <w:r>
-        <w:rPr>
-          <w:rFonts w:ascii="Times New Roman" w:hAnsi="Times New Roman"/>
-          <w:b/>
-          <w:sz w:val="23"/>
-        </w:rPr>
-        <w:t>Khởi chạy Chiến dịch Fuzzing (30 Trials)</w:t>
-      </w:r>
-      <w:r>
-        <w:rPr>
-          <w:rFonts w:ascii="Times New Roman" w:hAnsi="Times New Roman"/>
-          <w:b w:val="0"/>
-          <w:i w:val="0"/>
-          <w:sz w:val="23"/>
-        </w:rPr>
-        <w:t>: Theo dõi trực quan đồ thị tăng trưởng Branch Coverage và thời gian phát hiện lỗi đầu tiên (Time-to-first-crash).</w:t>
-      </w:r>
-    </w:p>
-    <w:p>
-      <w:pPr>
-        <w:spacing w:after="60" w:line="300" w:lineRule="auto"/>
-        <w:ind w:left="360"/>
-      </w:pPr>
-      <w:r>
-        <w:rPr>
-          <w:rFonts w:ascii="Times New Roman" w:hAnsi="Times New Roman"/>
-          <w:b w:val="0"/>
-          <w:i w:val="0"/>
-          <w:sz w:val="23"/>
-        </w:rPr>
-        <w:t xml:space="preserve">4. Xác thực nhật ký AddressSanitizer: Phát hiện vi phạm Stack Right Redzone </w:t>
-      </w:r>
+        <w:spacing w:before="80" w:after="80" w:line="276" w:lineRule="auto"/>
+        <w:ind w:left="432"/>
+        <w:pBdr>
+          <w:left w:val="single" w:sz="18" w:space="8" w:color="1F4E79"/>
+        </w:pBdr>
+        <w:shd w:fill="F4F6F8"/>
+      </w:pPr>
       <w:r>
         <w:rPr>
           <w:rFonts w:ascii="Consolas" w:hAnsi="Consolas"/>
-          <w:b/>
-          <w:color w:val="A02020"/>
-          <w:sz w:val="20"/>
-        </w:rPr>
-        <w:t>[f3]</w:t>
-      </w:r>
-      <w:r>
-        <w:rPr>
-          <w:rFonts w:ascii="Times New Roman" w:hAnsi="Times New Roman"/>
-          <w:b w:val="0"/>
-          <w:i w:val="0"/>
-          <w:sz w:val="23"/>
-        </w:rPr>
-        <w:t xml:space="preserve"> tại offset 112 của biến </w:t>
-      </w:r>
-      <w:r>
-        <w:rPr>
-          <w:rFonts w:ascii="Consolas" w:hAnsi="Consolas"/>
-          <w:b/>
-          <w:color w:val="A02020"/>
-          <w:sz w:val="20"/>
-        </w:rPr>
-        <w:t>stack_buf</w:t>
-      </w:r>
-      <w:r>
-        <w:rPr>
-          <w:rFonts w:ascii="Times New Roman" w:hAnsi="Times New Roman"/>
-          <w:b w:val="0"/>
-          <w:i w:val="0"/>
-          <w:sz w:val="23"/>
-        </w:rPr>
-        <w:t xml:space="preserve">, đồng thời chứng minh bản vá v₁ tuân thủ </w:t>
-      </w:r>
-      <w:r>
-        <w:rPr>
-          <w:rFonts w:ascii="Times New Roman" w:hAnsi="Times New Roman"/>
-          <w:b/>
-          <w:sz w:val="23"/>
-        </w:rPr>
-        <w:t>CERT STR31-C</w:t>
-      </w:r>
-      <w:r>
-        <w:rPr>
-          <w:rFonts w:ascii="Times New Roman" w:hAnsi="Times New Roman"/>
-          <w:b w:val="0"/>
-          <w:i w:val="0"/>
-          <w:sz w:val="23"/>
-        </w:rPr>
-        <w:t xml:space="preserve"> loại trừ 100% khiếm khuyết.</w:t>
+          <w:color w:val="1E1E46"/>
+          <w:sz w:val="18"/>
+        </w:rPr>
+        <w:t>python scripts/run_fzp1_benchmark.py</w:t>
+        <w:br/>
+        <w:t>python scripts/aggregate_results.py</w:t>
+        <w:br/>
+        <w:t>python scripts/generate_charts.py</w:t>
       </w:r>
     </w:p>
     <w:p>

</xml_diff>

<commit_message>
docs: remove 70% tool claim and align report narrative with independent project scope
</commit_message>
<xml_diff>
--- a/BaoCao_BTL_Nhom11.docx
+++ b/BaoCao_BTL_Nhom11.docx
@@ -627,7 +627,7 @@
           <w:i w:val="0"/>
           <w:sz w:val="23"/>
         </w:rPr>
-        <w:t>3.1. Triết lý Thực hiện: Khai thác Hạt nhân Tự động hóa Tool (70%) và Chiều sâu Nghiên cứu của Nhóm (30%)</w:t>
+        <w:t>3.1. Triết lý Thực hiện: Đặc tả SSOT Tương thích SecLab và Thực nghiệm Độc lập của Nhóm</w:t>
       </w:r>
     </w:p>
     <w:p>
@@ -3247,7 +3247,7 @@
           <w:color w:val="44546A"/>
           <w:sz w:val="24"/>
         </w:rPr>
-        <w:t>3.1. Triết lý Thực hiện: Khai thác Hạt nhân Tự động hóa Tool (70%) và Chiều sâu Nghiên cứu của Nhóm (30%)</w:t>
+        <w:t>3.1. Triết lý Thực hiện: Đặc tả SSOT Tương thích SecLab và Thực nghiệm Độc lập của Nhóm</w:t>
       </w:r>
     </w:p>
     <w:p>
@@ -3261,15 +3261,15 @@
           <w:i w:val="0"/>
           <w:sz w:val="23"/>
         </w:rPr>
-        <w:t xml:space="preserve">Tuân thủ chỉ đạo phương pháp luận của giảng viên: </w:t>
-      </w:r>
-      <w:r>
-        <w:rPr>
-          <w:rFonts w:ascii="Times New Roman" w:hAnsi="Times New Roman"/>
-          <w:i/>
-          <w:sz w:val="23"/>
-        </w:rPr>
-        <w:t>"Công cụ hỗ trợ 70% khối lượng tự động hóa, nhóm sinh viên đóng góp 30% phân tích bản chất bộ nhớ, đo lường định lượng khách quan và khắc phục chuẩn mực"</w:t>
+        <w:t xml:space="preserve">Đề tài được định vị học thuật rõ ràng và trung thực: </w:t>
+      </w:r>
+      <w:r>
+        <w:rPr>
+          <w:rFonts w:ascii="Times New Roman" w:hAnsi="Times New Roman"/>
+          <w:b/>
+          <w:sz w:val="23"/>
+        </w:rPr>
+        <w:t>Xây dựng bộ phân tích cú pháp và kiểm thử mờ FZP1 độc lập, với tệp đặc tả SSOT tương thích hoàn toàn với chuẩn đặc tả SecLab (`SpecVerificationLab`)</w:t>
       </w:r>
       <w:r>
         <w:rPr>
@@ -3278,7 +3278,7 @@
           <w:i w:val="0"/>
           <w:sz w:val="23"/>
         </w:rPr>
-        <w:t>, đề tài kết hợp chặt chẽ giữa bộ công cụ nền tảng của môn học và chiều sâu nghiên cứu của nhóm:</w:t>
+        <w:t>:</w:t>
       </w:r>
     </w:p>
     <w:p>
@@ -3292,7 +3292,7 @@
           <w:b/>
           <w:sz w:val="23"/>
         </w:rPr>
-        <w:t>Hạt nhân Tự động hóa từ Bộ Công cụ Môn học (70%):</w:t>
+        <w:t>Chuẩn hóa Đặc tả Hình thức Tương thích Bộ Công cụ Môn học (`SecLabFramework`):</w:t>
       </w:r>
     </w:p>
     <w:p>
@@ -3306,7 +3306,7 @@
           <w:b/>
           <w:sz w:val="23"/>
         </w:rPr>
-        <w:t>Hạt nhân Đặc tả &amp; Kiểm chứng Hình thức (`SecLabFramework`):</w:t>
+        <w:t>Tệp đặc tả SSOT Excel 10-sheet (`specification/Nhom11_FZP1_Fuzzing_Spec.xlsx`):</w:t>
       </w:r>
       <w:r>
         <w:rPr>
@@ -3315,7 +3315,7 @@
           <w:i w:val="0"/>
           <w:sz w:val="23"/>
         </w:rPr>
-        <w:t xml:space="preserve"> Đóng vai trò là Nguồn Chân lý Đơn nhất (SSOT Kernel), quản lý tệp đặc tả Excel 10-sheet (</w:t>
+        <w:t xml:space="preserve"> Được thiết kế tuân thủ 100% cấu trúc schema, tên sheet, thứ tự và định dạng kiểu dữ liệu của công cụ </w:t>
       </w:r>
       <w:r>
         <w:rPr>
@@ -3324,7 +3324,7 @@
           <w:color w:val="A02020"/>
           <w:sz w:val="20"/>
         </w:rPr>
-        <w:t>specification/Nhom11_FZP1_Fuzzing_Spec.xlsx</w:t>
+        <w:t>SpecVerificationLab</w:t>
       </w:r>
       <w:r>
         <w:rPr>
@@ -3333,7 +3333,30 @@
           <w:i w:val="0"/>
           <w:sz w:val="23"/>
         </w:rPr>
-        <w:t xml:space="preserve">). Thực hiện tự động hóa kiểm chứng hình thức mô hình Kripke 4 trạng thái, kiểm toán công thức CTL AG(¬ violation), bóc tách AST và giải SMT Bit-Vector kiểm tra nguy cơ tràn số int32 tại sheet </w:t>
+        <w:t xml:space="preserve"> (Tab Ch6).</w:t>
+      </w:r>
+    </w:p>
+    <w:p>
+      <w:pPr>
+        <w:pStyle w:val="ListBullet"/>
+        <w:spacing w:after="60" w:line="300" w:lineRule="auto"/>
+      </w:pPr>
+      <w:r>
+        <w:rPr>
+          <w:rFonts w:ascii="Times New Roman" w:hAnsi="Times New Roman"/>
+          <w:b/>
+          <w:sz w:val="23"/>
+        </w:rPr>
+        <w:t>Mô hình hóa hình thức:</w:t>
+      </w:r>
+      <w:r>
+        <w:rPr>
+          <w:rFonts w:ascii="Times New Roman" w:hAnsi="Times New Roman"/>
+          <w:b w:val="0"/>
+          <w:i w:val="0"/>
+          <w:sz w:val="23"/>
+        </w:rPr>
+        <w:t xml:space="preserve"> Định nghĩa mô hình Kripke 4 trạng thái, các công thức CTL kiểm tra tính an toàn/sống còn, và cặp loại trừ lẫn nhau </w:t>
       </w:r>
       <w:r>
         <w:rPr>
@@ -3342,7 +3365,7 @@
           <w:color w:val="A02020"/>
           <w:sz w:val="20"/>
         </w:rPr>
-        <w:t>KiemTraSoHoc</w:t>
+        <w:t>magic_ok</w:t>
       </w:r>
       <w:r>
         <w:rPr>
@@ -3351,47 +3374,7 @@
           <w:i w:val="0"/>
           <w:sz w:val="23"/>
         </w:rPr>
-        <w:t>, đồng thời sinh mã phân tích các hàm khuôn mẫu kiểm toán an toàn (CWE-121, 401, 415, 416, 369, 798).</w:t>
-      </w:r>
-    </w:p>
-    <w:p>
-      <w:pPr>
-        <w:pStyle w:val="ListBullet"/>
-        <w:spacing w:after="60" w:line="300" w:lineRule="auto"/>
-      </w:pPr>
-      <w:r>
-        <w:rPr>
-          <w:rFonts w:ascii="Times New Roman" w:hAnsi="Times New Roman"/>
-          <w:b/>
-          <w:sz w:val="23"/>
-        </w:rPr>
-        <w:t>Nền tảng Kiểm thử Mờ Động (`softsec-toolkit/ch4_dynafuzz`):</w:t>
-      </w:r>
-      <w:r>
-        <w:rPr>
-          <w:rFonts w:ascii="Times New Roman" w:hAnsi="Times New Roman"/>
-          <w:b w:val="0"/>
-          <w:i w:val="0"/>
-          <w:sz w:val="23"/>
-        </w:rPr>
-        <w:t xml:space="preserve"> Căn cứ theo định hướng Chủ đề 4 (Slide 15–16 bài giảng </w:t>
-      </w:r>
-      <w:r>
-        <w:rPr>
-          <w:rFonts w:ascii="Times New Roman" w:hAnsi="Times New Roman"/>
-          <w:i/>
-          <w:sz w:val="23"/>
-        </w:rPr>
-        <w:t>Hướng dẫn Đề tài Đồ án Môn học</w:t>
-      </w:r>
-      <w:r>
-        <w:rPr>
-          <w:rFonts w:ascii="Times New Roman" w:hAnsi="Times New Roman"/>
-          <w:b w:val="0"/>
-          <w:i w:val="0"/>
-          <w:sz w:val="23"/>
-        </w:rPr>
-        <w:t xml:space="preserve">), nhóm kế thừa kiến trúc và các thuật toán cốt lõi từ </w:t>
+        <w:t xml:space="preserve"> vs </w:t>
       </w:r>
       <w:r>
         <w:rPr>
@@ -3400,7 +3383,7 @@
           <w:color w:val="A02020"/>
           <w:sz w:val="20"/>
         </w:rPr>
-        <w:t>ch4_dynafuzz</w:t>
+        <w:t>checksum_ok</w:t>
       </w:r>
       <w:r>
         <w:rPr>
@@ -3409,7 +3392,67 @@
           <w:i w:val="0"/>
           <w:sz w:val="23"/>
         </w:rPr>
-        <w:t xml:space="preserve"> (kiểm thử hộp đen ngẫu nhiên </w:t>
+        <w:t xml:space="preserve"> theo đúng giới hạn kiến trúc của tool (1 cặp duy nhất).</w:t>
+      </w:r>
+    </w:p>
+    <w:p>
+      <w:pPr>
+        <w:pStyle w:val="ListBullet"/>
+        <w:spacing w:after="60" w:line="300" w:lineRule="auto"/>
+      </w:pPr>
+      <w:r>
+        <w:rPr>
+          <w:rFonts w:ascii="Times New Roman" w:hAnsi="Times New Roman"/>
+          <w:i/>
+          <w:sz w:val="23"/>
+        </w:rPr>
+        <w:t>Lưu ý về tính trung thực học thuật:</w:t>
+      </w:r>
+      <w:r>
+        <w:rPr>
+          <w:rFonts w:ascii="Times New Roman" w:hAnsi="Times New Roman"/>
+          <w:b w:val="0"/>
+          <w:i w:val="0"/>
+          <w:sz w:val="23"/>
+        </w:rPr>
+        <w:t xml:space="preserve"> Bộ sinh mã của SecLab chỉ tạo các hàm khuôn mẫu đơn lẻ; nhóm không tuyên bố công cụ tự động sinh trọn gói mã nguồn bộ phân tích FZP1 hay sinh toàn bộ dự án.</w:t>
+      </w:r>
+    </w:p>
+    <w:p>
+      <w:pPr>
+        <w:pStyle w:val="ListBullet"/>
+        <w:spacing w:after="60" w:line="300" w:lineRule="auto"/>
+      </w:pPr>
+      <w:r>
+        <w:rPr>
+          <w:rFonts w:ascii="Times New Roman" w:hAnsi="Times New Roman"/>
+          <w:b/>
+          <w:sz w:val="23"/>
+        </w:rPr>
+        <w:t>Nghiên cứu &amp; Thực nghiệm Độc lập của Nhóm:</w:t>
+      </w:r>
+    </w:p>
+    <w:p>
+      <w:pPr>
+        <w:pStyle w:val="ListBullet"/>
+        <w:spacing w:after="60" w:line="300" w:lineRule="auto"/>
+      </w:pPr>
+      <w:r>
+        <w:rPr>
+          <w:rFonts w:ascii="Times New Roman" w:hAnsi="Times New Roman"/>
+          <w:b/>
+          <w:sz w:val="23"/>
+        </w:rPr>
+        <w:t>Hiện thực Bộ Parser FZP1 Nhị phân Hoàn chỉnh:</w:t>
+      </w:r>
+      <w:r>
+        <w:rPr>
+          <w:rFonts w:ascii="Times New Roman" w:hAnsi="Times New Roman"/>
+          <w:b w:val="0"/>
+          <w:i w:val="0"/>
+          <w:sz w:val="23"/>
+        </w:rPr>
+        <w:t xml:space="preserve"> Nhóm tự tay lập trình bộ phân tích cú pháp C nhị phân (</w:t>
       </w:r>
       <w:r>
         <w:rPr>
@@ -3418,7 +3461,7 @@
           <w:color w:val="A02020"/>
           <w:sz w:val="20"/>
         </w:rPr>
-        <w:t>random mutation</w:t>
+        <w:t>source/fzp1_parser_v0.c</w:t>
       </w:r>
       <w:r>
         <w:rPr>
@@ -3427,7 +3470,7 @@
           <w:i w:val="0"/>
           <w:sz w:val="23"/>
         </w:rPr>
-        <w:t xml:space="preserve">, bao gói giao thức cấu trúc </w:t>
+        <w:t xml:space="preserve"> và </w:t>
       </w:r>
       <w:r>
         <w:rPr>
@@ -3436,7 +3479,7 @@
           <w:color w:val="A02020"/>
           <w:sz w:val="20"/>
         </w:rPr>
-        <w:t>greybox</w:t>
+        <w:t>source/fzp1_parser_v1.c</w:t>
       </w:r>
       <w:r>
         <w:rPr>
@@ -3445,7 +3488,30 @@
           <w:i w:val="0"/>
           <w:sz w:val="23"/>
         </w:rPr>
-        <w:t xml:space="preserve">, và kỹ thuật thực thi ký hiệu concolic </w:t>
+        <w:t>), cài đặt cấu trúc tệp nhị phân 4B Magic + 1B Length + Payload + 1B XOR Checksum, bộ đệm ngăn xếp 16 byte, và vòng đời run-to-completion thu hồi Heap an toàn.</w:t>
+      </w:r>
+    </w:p>
+    <w:p>
+      <w:pPr>
+        <w:pStyle w:val="ListBullet"/>
+        <w:spacing w:after="60" w:line="300" w:lineRule="auto"/>
+      </w:pPr>
+      <w:r>
+        <w:rPr>
+          <w:rFonts w:ascii="Times New Roman" w:hAnsi="Times New Roman"/>
+          <w:b/>
+          <w:sz w:val="23"/>
+        </w:rPr>
+        <w:t>Phát triển Module Fuzzer Mở rộng (`source/ch4_dynafuzz_fzp1.py`):</w:t>
+      </w:r>
+      <w:r>
+        <w:rPr>
+          <w:rFonts w:ascii="Times New Roman" w:hAnsi="Times New Roman"/>
+          <w:b w:val="0"/>
+          <w:i w:val="0"/>
+          <w:sz w:val="23"/>
+        </w:rPr>
+        <w:t xml:space="preserve"> Dựa trên kiến trúc thuật toán </w:t>
       </w:r>
       <w:r>
         <w:rPr>
@@ -3454,7 +3520,7 @@
           <w:color w:val="A02020"/>
           <w:sz w:val="20"/>
         </w:rPr>
-        <w:t>04_concolic_execution.py</w:t>
+        <w:t>ch4_dynafuzz</w:t>
       </w:r>
       <w:r>
         <w:rPr>
@@ -3463,7 +3529,7 @@
           <w:i w:val="0"/>
           <w:sz w:val="23"/>
         </w:rPr>
-        <w:t xml:space="preserve">, </w:t>
+        <w:t xml:space="preserve"> được hướng dẫn ở Chủ đề 4, nhóm xây dựng module mở rộng với 3 fuzzer chuyên biệt (</w:t>
       </w:r>
       <w:r>
         <w:rPr>
@@ -3472,7 +3538,7 @@
           <w:color w:val="A02020"/>
           <w:sz w:val="20"/>
         </w:rPr>
-        <w:t>06_white_box_fuzzing.py</w:t>
+        <w:t>FZP1BlackBoxFuzzer</w:t>
       </w:r>
       <w:r>
         <w:rPr>
@@ -3481,67 +3547,7 @@
           <w:i w:val="0"/>
           <w:sz w:val="23"/>
         </w:rPr>
-        <w:t>).</w:t>
-      </w:r>
-    </w:p>
-    <w:p>
-      <w:pPr>
-        <w:pStyle w:val="ListBullet"/>
-        <w:spacing w:after="60" w:line="300" w:lineRule="auto"/>
-      </w:pPr>
-      <w:r>
-        <w:rPr>
-          <w:rFonts w:ascii="Times New Roman" w:hAnsi="Times New Roman"/>
-          <w:i/>
-          <w:sz w:val="23"/>
-        </w:rPr>
-        <w:t>Lưu ý về tính trung thực học thuật:</w:t>
-      </w:r>
-      <w:r>
-        <w:rPr>
-          <w:rFonts w:ascii="Times New Roman" w:hAnsi="Times New Roman"/>
-          <w:b w:val="0"/>
-          <w:i w:val="0"/>
-          <w:sz w:val="23"/>
-        </w:rPr>
-        <w:t xml:space="preserve"> Bộ sinh mã của SecLab chỉ tạo các hàm khuôn mẫu đơn lẻ; nhóm không tuyên bố công cụ tự động tổng hợp trọn gói bộ phân tích cú pháp tệp nhị phân FZP1.</w:t>
-      </w:r>
-    </w:p>
-    <w:p>
-      <w:pPr>
-        <w:pStyle w:val="ListBullet"/>
-        <w:spacing w:after="60" w:line="300" w:lineRule="auto"/>
-      </w:pPr>
-      <w:r>
-        <w:rPr>
-          <w:rFonts w:ascii="Times New Roman" w:hAnsi="Times New Roman"/>
-          <w:b/>
-          <w:sz w:val="23"/>
-        </w:rPr>
-        <w:t>Nghiên cứu Thực nghiệm Độc lập &amp; Chiều sâu Chuyên môn của Nhóm (30%):</w:t>
-      </w:r>
-    </w:p>
-    <w:p>
-      <w:pPr>
-        <w:pStyle w:val="ListBullet"/>
-        <w:spacing w:after="60" w:line="300" w:lineRule="auto"/>
-      </w:pPr>
-      <w:r>
-        <w:rPr>
-          <w:rFonts w:ascii="Times New Roman" w:hAnsi="Times New Roman"/>
-          <w:b/>
-          <w:sz w:val="23"/>
-        </w:rPr>
-        <w:t>Hiện thực Bộ Parser FZP1 Nhị phân Hoàn chỉnh:</w:t>
-      </w:r>
-      <w:r>
-        <w:rPr>
-          <w:rFonts w:ascii="Times New Roman" w:hAnsi="Times New Roman"/>
-          <w:b w:val="0"/>
-          <w:i w:val="0"/>
-          <w:sz w:val="23"/>
-        </w:rPr>
-        <w:t xml:space="preserve"> Nhóm tự tay lập trình bộ phân tích cú pháp C nhị phân (</w:t>
+        <w:t xml:space="preserve">, </w:t>
       </w:r>
       <w:r>
         <w:rPr>
@@ -3550,7 +3556,7 @@
           <w:color w:val="A02020"/>
           <w:sz w:val="20"/>
         </w:rPr>
-        <w:t>source/fzp1_parser_v0.c</w:t>
+        <w:t>FZP1GreyboxFuzzer</w:t>
       </w:r>
       <w:r>
         <w:rPr>
@@ -3559,7 +3565,7 @@
           <w:i w:val="0"/>
           <w:sz w:val="23"/>
         </w:rPr>
-        <w:t xml:space="preserve"> và </w:t>
+        <w:t xml:space="preserve">, </w:t>
       </w:r>
       <w:r>
         <w:rPr>
@@ -3568,7 +3574,7 @@
           <w:color w:val="A02020"/>
           <w:sz w:val="20"/>
         </w:rPr>
-        <w:t>source/fzp1_parser_v1.c</w:t>
+        <w:t>FZP1WhiteBoxFuzzer</w:t>
       </w:r>
       <w:r>
         <w:rPr>
@@ -3577,7 +3583,7 @@
           <w:i w:val="0"/>
           <w:sz w:val="23"/>
         </w:rPr>
-        <w:t>), cài đặt cấu trúc tệp nhị phân 4B Magic + 1B Length + Payload + 1B XOR Checksum, bộ đệm ngăn xếp 16 byte, và vòng đời run-to-completion thu hồi Heap an toàn.</w:t>
+        <w:t>). Trong đó, fuzzer White-box được nhóm mô hình hóa thủ công điều kiện rẽ nhánh (path condition) của parser bằng Z3 SMT Bit-Vector solver để tự động tổng hợp gói tin vượt rào cản.</w:t>
       </w:r>
     </w:p>
     <w:p>
@@ -3591,7 +3597,7 @@
           <w:b/>
           <w:sz w:val="23"/>
         </w:rPr>
-        <w:t>Phát triển Module Fuzzer Mở rộng (`source/ch4_dynafuzz_fzp1.py`):</w:t>
+        <w:t>Phân tích Bản chất Ô nhớ Mức thấp:</w:t>
       </w:r>
       <w:r>
         <w:rPr>
@@ -3600,7 +3606,7 @@
           <w:i w:val="0"/>
           <w:sz w:val="23"/>
         </w:rPr>
-        <w:t xml:space="preserve"> Kế thừa kiến trúc </w:t>
+        <w:t xml:space="preserve"> Nhóm phân tích chi tiết cơ chế ô nhớ Stack Frame x86_64, phân tích shadow bytes AddressSanitizer (</w:t>
       </w:r>
       <w:r>
         <w:rPr>
@@ -3609,7 +3615,7 @@
           <w:color w:val="A02020"/>
           <w:sz w:val="20"/>
         </w:rPr>
-        <w:t>ch4_dynafuzz</w:t>
+        <w:t>[f3]</w:t>
       </w:r>
       <w:r>
         <w:rPr>
@@ -3618,16 +3624,15 @@
           <w:i w:val="0"/>
           <w:sz w:val="23"/>
         </w:rPr>
-        <w:t>, nhóm xây dựng module mở rộng với 3 fuzzer chuyên biệt (</w:t>
-      </w:r>
-      <w:r>
-        <w:rPr>
-          <w:rFonts w:ascii="Consolas" w:hAnsi="Consolas"/>
+        <w:t xml:space="preserve">), chứng minh điểm mù phân tích tĩnh của Cppcheck, và xây dựng bản vá hoàn chỉnh chuẩn </w:t>
+      </w:r>
+      <w:r>
+        <w:rPr>
+          <w:rFonts w:ascii="Times New Roman" w:hAnsi="Times New Roman"/>
           <w:b/>
-          <w:color w:val="A02020"/>
-          <w:sz w:val="20"/>
-        </w:rPr>
-        <w:t>FZP1BlackBoxFuzzer</w:t>
+          <w:sz w:val="23"/>
+        </w:rPr>
+        <w:t>CERT C</w:t>
       </w:r>
       <w:r>
         <w:rPr>
@@ -3636,61 +3641,7 @@
           <w:i w:val="0"/>
           <w:sz w:val="23"/>
         </w:rPr>
-        <w:t xml:space="preserve">, </w:t>
-      </w:r>
-      <w:r>
-        <w:rPr>
-          <w:rFonts w:ascii="Consolas" w:hAnsi="Consolas"/>
-          <w:b/>
-          <w:color w:val="A02020"/>
-          <w:sz w:val="20"/>
-        </w:rPr>
-        <w:t>FZP1GreyboxFuzzer</w:t>
-      </w:r>
-      <w:r>
-        <w:rPr>
-          <w:rFonts w:ascii="Times New Roman" w:hAnsi="Times New Roman"/>
-          <w:b w:val="0"/>
-          <w:i w:val="0"/>
-          <w:sz w:val="23"/>
-        </w:rPr>
-        <w:t xml:space="preserve">, </w:t>
-      </w:r>
-      <w:r>
-        <w:rPr>
-          <w:rFonts w:ascii="Consolas" w:hAnsi="Consolas"/>
-          <w:b/>
-          <w:color w:val="A02020"/>
-          <w:sz w:val="20"/>
-        </w:rPr>
-        <w:t>FZP1WhiteBoxFuzzer</w:t>
-      </w:r>
-      <w:r>
-        <w:rPr>
-          <w:rFonts w:ascii="Times New Roman" w:hAnsi="Times New Roman"/>
-          <w:b w:val="0"/>
-          <w:i w:val="0"/>
-          <w:sz w:val="23"/>
-        </w:rPr>
-        <w:t xml:space="preserve">). Trong đó, fuzzer White-box được nhóm trực tiếp phân tích mã nguồn parser và mô hình hóa thủ công điều kiện rẽ nhánh (path condition) thành hệ phương trình Bit-Vector trong Z3 Solver (ràng buộc 4 byte Magic </w:t>
-      </w:r>
-      <w:r>
-        <w:rPr>
-          <w:rFonts w:ascii="Consolas" w:hAnsi="Consolas"/>
-          <w:b/>
-          <w:color w:val="A02020"/>
-          <w:sz w:val="20"/>
-        </w:rPr>
-        <w:t>"FZP1"</w:t>
-      </w:r>
-      <w:r>
-        <w:rPr>
-          <w:rFonts w:ascii="Times New Roman" w:hAnsi="Times New Roman"/>
-          <w:b w:val="0"/>
-          <w:i w:val="0"/>
-          <w:sz w:val="23"/>
-        </w:rPr>
-        <w:t>, chọn độ dài payload L &gt; 16 để kích hoạt nhánh tràn ngăn xếp, và giải ngược XOR Checksum để vượt qua xác thực), tự động tổng hợp gói tin khai thác thỏa mãn (SAT).</w:t>
+        <w:t xml:space="preserve"> (CERT STR31-C, MEM30-C, MEM31-C).</w:t>
       </w:r>
     </w:p>
     <w:p>
@@ -3704,7 +3655,7 @@
           <w:b/>
           <w:sz w:val="23"/>
         </w:rPr>
-        <w:t>Phân tích Bản chất Ô nhớ Mức thấp:</w:t>
+        <w:t>Thiết kế Benchmark 30 Trials Khách quan:</w:t>
       </w:r>
       <w:r>
         <w:rPr>
@@ -3713,65 +3664,7 @@
           <w:i w:val="0"/>
           <w:sz w:val="23"/>
         </w:rPr>
-        <w:t xml:space="preserve"> Nhóm phân tích chi tiết cơ chế ô nhớ Stack Frame x86_64, phân tích shadow bytes AddressSanitizer (</w:t>
-      </w:r>
-      <w:r>
-        <w:rPr>
-          <w:rFonts w:ascii="Consolas" w:hAnsi="Consolas"/>
-          <w:b/>
-          <w:color w:val="A02020"/>
-          <w:sz w:val="20"/>
-        </w:rPr>
-        <w:t>[f3]</w:t>
-      </w:r>
-      <w:r>
-        <w:rPr>
-          <w:rFonts w:ascii="Times New Roman" w:hAnsi="Times New Roman"/>
-          <w:b w:val="0"/>
-          <w:i w:val="0"/>
-          <w:sz w:val="23"/>
-        </w:rPr>
-        <w:t xml:space="preserve">), chứng minh điểm mù phân tích tĩnh của Cppcheck, và xây dựng bản vá hoàn chỉnh chuẩn </w:t>
-      </w:r>
-      <w:r>
-        <w:rPr>
-          <w:rFonts w:ascii="Times New Roman" w:hAnsi="Times New Roman"/>
-          <w:b/>
-          <w:sz w:val="23"/>
-        </w:rPr>
-        <w:t>CERT C</w:t>
-      </w:r>
-      <w:r>
-        <w:rPr>
-          <w:rFonts w:ascii="Times New Roman" w:hAnsi="Times New Roman"/>
-          <w:b w:val="0"/>
-          <w:i w:val="0"/>
-          <w:sz w:val="23"/>
-        </w:rPr>
-        <w:t xml:space="preserve"> (CERT STR31-C, MEM30-C, MEM31-C).</w:t>
-      </w:r>
-    </w:p>
-    <w:p>
-      <w:pPr>
-        <w:pStyle w:val="ListBullet"/>
-        <w:spacing w:after="60" w:line="300" w:lineRule="auto"/>
-      </w:pPr>
-      <w:r>
-        <w:rPr>
-          <w:rFonts w:ascii="Times New Roman" w:hAnsi="Times New Roman"/>
-          <w:b/>
-          <w:sz w:val="23"/>
-        </w:rPr>
-        <w:t>Thiết kế Benchmark 30 Trials Khách quan:</w:t>
-      </w:r>
-      <w:r>
-        <w:rPr>
-          <w:rFonts w:ascii="Times New Roman" w:hAnsi="Times New Roman"/>
-          <w:b w:val="0"/>
-          <w:i w:val="0"/>
-          <w:sz w:val="23"/>
-        </w:rPr>
-        <w:t xml:space="preserve"> Thực thi 30 lượt đo kiểm độc lập, ghi nhận và trực quan hóa dữ liệu thống kê khách quan.</w:t>
+        <w:t xml:space="preserve"> Thực thi 30 lượt đo kiểm độc lập bằng mã nguồn thực tế, ghi nhận và trực quan hóa dữ liệu thống kê khách quan.</w:t>
       </w:r>
     </w:p>
     <w:p>

</xml_diff>